<commit_message>
Present requirements and docs as formal specification; drop working notes
Co-Authored-By: Claude Opus 5.5 <noreply@anthropic.com>
</commit_message>
<xml_diff>
--- a/docs/requisitos.docx
+++ b/docs/requisitos.docx
@@ -15,45 +15,7 @@
         <w:spacing w:after="120"/>
       </w:pPr>
       <w:r>
-        <w:t xml:space="preserve">Sistema de Gestión Documental — VIALZACHIN E.P. · Tesis UDLA (VHQP V1.8, Capítulo 3, Tablas 10–13).</w:t>
-      </w:r>
-    </w:p>
-    <w:p>
-      <w:pPr>
-        <w:spacing w:after="120"/>
-        <w:rPr>
-          <w:b/>
-          <w:bCs/>
-        </w:rPr>
-      </w:pPr>
-      <w:r>
-        <w:rPr>
-          <w:b/>
-          <w:bCs/>
-        </w:rPr>
-        <w:t xml:space="preserve">Estado a la fecha 2026-10-12: RF 0/26 · RNF 0/7 · RN 0/6 cumplidos.</w:t>
-      </w:r>
-    </w:p>
-    <w:p>
-      <w:pPr>
-        <w:spacing w:after="120"/>
-        <w:rPr>
-          <w:i/>
-          <w:iCs/>
-          <w:color w:val="666666"/>
-          <w:sz w:val="18"/>
-          <w:szCs w:val="18"/>
-        </w:rPr>
-      </w:pPr>
-      <w:r>
-        <w:rPr>
-          <w:i/>
-          <w:iCs/>
-          <w:color w:val="666666"/>
-          <w:sz w:val="18"/>
-          <w:szCs w:val="18"/>
-        </w:rPr>
-        <w:t xml:space="preserve">Generado desde docs/requisitos.md; ese archivo es la fuente y este documento se regenera al actualizarlo.</w:t>
+        <w:t xml:space="preserve">Sistema de Gestión Documental — VIALZACHIN E.P. · Trabajo de Integración Curricular, UDLA.</w:t>
       </w:r>
     </w:p>
     <w:p>
@@ -86,11 +48,10 @@
         </w:tblBorders>
       </w:tblPr>
       <w:tblGrid>
-        <w:gridCol w:w="1632"/>
-        <w:gridCol w:w="1484"/>
-        <w:gridCol w:w="6235"/>
-        <w:gridCol w:w="3265"/>
-        <w:gridCol w:w="1784"/>
+        <w:gridCol w:w="1963"/>
+        <w:gridCol w:w="6872"/>
+        <w:gridCol w:w="3600"/>
+        <w:gridCol w:w="1965"/>
       </w:tblGrid>
       <w:tr>
         <w:trPr>
@@ -98,7 +59,7 @@
         </w:trPr>
         <w:tc>
           <w:tcPr>
-            <w:tcW w:type="dxa" w:w="1632"/>
+            <w:tcW w:type="dxa" w:w="1963"/>
             <w:tcBorders>
               <w:top w:val="single" w:color="999999" w:sz="4"/>
               <w:left w:val="single" w:color="999999" w:sz="4"/>
@@ -122,13 +83,13 @@
                 <w:sz w:val="19"/>
                 <w:szCs w:val="19"/>
               </w:rPr>
-              <w:t xml:space="preserve">Estado</w:t>
-            </w:r>
-          </w:p>
-        </w:tc>
-        <w:tc>
-          <w:tcPr>
-            <w:tcW w:type="dxa" w:w="1484"/>
+              <w:t xml:space="preserve">ID</w:t>
+            </w:r>
+          </w:p>
+        </w:tc>
+        <w:tc>
+          <w:tcPr>
+            <w:tcW w:type="dxa" w:w="6872"/>
             <w:tcBorders>
               <w:top w:val="single" w:color="999999" w:sz="4"/>
               <w:left w:val="single" w:color="999999" w:sz="4"/>
@@ -152,13 +113,13 @@
                 <w:sz w:val="19"/>
                 <w:szCs w:val="19"/>
               </w:rPr>
-              <w:t xml:space="preserve">ID</w:t>
-            </w:r>
-          </w:p>
-        </w:tc>
-        <w:tc>
-          <w:tcPr>
-            <w:tcW w:type="dxa" w:w="6235"/>
+              <w:t xml:space="preserve">Funcionalidad</w:t>
+            </w:r>
+          </w:p>
+        </w:tc>
+        <w:tc>
+          <w:tcPr>
+            <w:tcW w:type="dxa" w:w="3600"/>
             <w:tcBorders>
               <w:top w:val="single" w:color="999999" w:sz="4"/>
               <w:left w:val="single" w:color="999999" w:sz="4"/>
@@ -182,13 +143,13 @@
                 <w:sz w:val="19"/>
                 <w:szCs w:val="19"/>
               </w:rPr>
-              <w:t xml:space="preserve">Funcionalidad</w:t>
-            </w:r>
-          </w:p>
-        </w:tc>
-        <w:tc>
-          <w:tcPr>
-            <w:tcW w:type="dxa" w:w="3265"/>
+              <w:t xml:space="preserve">Actor</w:t>
+            </w:r>
+          </w:p>
+        </w:tc>
+        <w:tc>
+          <w:tcPr>
+            <w:tcW w:type="dxa" w:w="1965"/>
             <w:tcBorders>
               <w:top w:val="single" w:color="999999" w:sz="4"/>
               <w:left w:val="single" w:color="999999" w:sz="4"/>
@@ -212,37 +173,7 @@
                 <w:sz w:val="19"/>
                 <w:szCs w:val="19"/>
               </w:rPr>
-              <w:t xml:space="preserve">Actor</w:t>
-            </w:r>
-          </w:p>
-        </w:tc>
-        <w:tc>
-          <w:tcPr>
-            <w:tcW w:type="dxa" w:w="1784"/>
-            <w:tcBorders>
-              <w:top w:val="single" w:color="999999" w:sz="4"/>
-              <w:left w:val="single" w:color="999999" w:sz="4"/>
-              <w:bottom w:val="single" w:color="999999" w:sz="4"/>
-              <w:right w:val="single" w:color="999999" w:sz="4"/>
-            </w:tcBorders>
-            <w:shd w:fill="1B5E3A" w:color="auto" w:val="clear"/>
-            <w:tcMar>
-              <w:top w:type="dxa" w:w="60"/>
-              <w:left w:type="dxa" w:w="100"/>
-              <w:bottom w:type="dxa" w:w="60"/>
-              <w:right w:type="dxa" w:w="100"/>
-            </w:tcMar>
-          </w:tcPr>
-          <w:p>
-            <w:r>
-              <w:rPr>
-                <w:b/>
-                <w:bCs/>
-                <w:color w:val="FFFFFF"/>
-                <w:sz w:val="19"/>
-                <w:szCs w:val="19"/>
-              </w:rPr>
-              <w:t xml:space="preserve">Prioridad (MoSCoW)</w:t>
+              <w:t xml:space="preserve">Prioridad</w:t>
             </w:r>
           </w:p>
         </w:tc>
@@ -253,37 +184,7 @@
         </w:trPr>
         <w:tc>
           <w:tcPr>
-            <w:tcW w:type="dxa" w:w="1632"/>
-            <w:tcBorders>
-              <w:top w:val="single" w:color="999999" w:sz="4"/>
-              <w:left w:val="single" w:color="999999" w:sz="4"/>
-              <w:bottom w:val="single" w:color="999999" w:sz="4"/>
-              <w:right w:val="single" w:color="999999" w:sz="4"/>
-            </w:tcBorders>
-            <w:shd w:fill="FFFFFF" w:color="auto" w:val="clear"/>
-            <w:tcMar>
-              <w:top w:type="dxa" w:w="60"/>
-              <w:left w:type="dxa" w:w="100"/>
-              <w:bottom w:type="dxa" w:w="60"/>
-              <w:right w:type="dxa" w:w="100"/>
-            </w:tcMar>
-          </w:tcPr>
-          <w:p>
-            <w:r>
-              <w:rPr>
-                <w:b w:val="false"/>
-                <w:bCs w:val="false"/>
-                <w:color w:val="000000"/>
-                <w:sz w:val="19"/>
-                <w:szCs w:val="19"/>
-              </w:rPr>
-              <w:t xml:space="preserve">Pendiente</w:t>
-            </w:r>
-          </w:p>
-        </w:tc>
-        <w:tc>
-          <w:tcPr>
-            <w:tcW w:type="dxa" w:w="1484"/>
+            <w:tcW w:type="dxa" w:w="1963"/>
             <w:tcBorders>
               <w:top w:val="single" w:color="999999" w:sz="4"/>
               <w:left w:val="single" w:color="999999" w:sz="4"/>
@@ -313,7 +214,7 @@
         </w:tc>
         <w:tc>
           <w:tcPr>
-            <w:tcW w:type="dxa" w:w="6235"/>
+            <w:tcW w:type="dxa" w:w="6872"/>
             <w:tcBorders>
               <w:top w:val="single" w:color="999999" w:sz="4"/>
               <w:left w:val="single" w:color="999999" w:sz="4"/>
@@ -343,7 +244,7 @@
         </w:tc>
         <w:tc>
           <w:tcPr>
-            <w:tcW w:type="dxa" w:w="3265"/>
+            <w:tcW w:type="dxa" w:w="3600"/>
             <w:tcBorders>
               <w:top w:val="single" w:color="999999" w:sz="4"/>
               <w:left w:val="single" w:color="999999" w:sz="4"/>
@@ -373,7 +274,7 @@
         </w:tc>
         <w:tc>
           <w:tcPr>
-            <w:tcW w:type="dxa" w:w="1784"/>
+            <w:tcW w:type="dxa" w:w="1965"/>
             <w:tcBorders>
               <w:top w:val="single" w:color="999999" w:sz="4"/>
               <w:left w:val="single" w:color="999999" w:sz="4"/>
@@ -408,37 +309,7 @@
         </w:trPr>
         <w:tc>
           <w:tcPr>
-            <w:tcW w:type="dxa" w:w="1632"/>
-            <w:tcBorders>
-              <w:top w:val="single" w:color="999999" w:sz="4"/>
-              <w:left w:val="single" w:color="999999" w:sz="4"/>
-              <w:bottom w:val="single" w:color="999999" w:sz="4"/>
-              <w:right w:val="single" w:color="999999" w:sz="4"/>
-            </w:tcBorders>
-            <w:shd w:fill="FFFFFF" w:color="auto" w:val="clear"/>
-            <w:tcMar>
-              <w:top w:type="dxa" w:w="60"/>
-              <w:left w:type="dxa" w:w="100"/>
-              <w:bottom w:type="dxa" w:w="60"/>
-              <w:right w:type="dxa" w:w="100"/>
-            </w:tcMar>
-          </w:tcPr>
-          <w:p>
-            <w:r>
-              <w:rPr>
-                <w:b w:val="false"/>
-                <w:bCs w:val="false"/>
-                <w:color w:val="000000"/>
-                <w:sz w:val="19"/>
-                <w:szCs w:val="19"/>
-              </w:rPr>
-              <w:t xml:space="preserve">Pendiente</w:t>
-            </w:r>
-          </w:p>
-        </w:tc>
-        <w:tc>
-          <w:tcPr>
-            <w:tcW w:type="dxa" w:w="1484"/>
+            <w:tcW w:type="dxa" w:w="1963"/>
             <w:tcBorders>
               <w:top w:val="single" w:color="999999" w:sz="4"/>
               <w:left w:val="single" w:color="999999" w:sz="4"/>
@@ -468,7 +339,7 @@
         </w:tc>
         <w:tc>
           <w:tcPr>
-            <w:tcW w:type="dxa" w:w="6235"/>
+            <w:tcW w:type="dxa" w:w="6872"/>
             <w:tcBorders>
               <w:top w:val="single" w:color="999999" w:sz="4"/>
               <w:left w:val="single" w:color="999999" w:sz="4"/>
@@ -498,7 +369,7 @@
         </w:tc>
         <w:tc>
           <w:tcPr>
-            <w:tcW w:type="dxa" w:w="3265"/>
+            <w:tcW w:type="dxa" w:w="3600"/>
             <w:tcBorders>
               <w:top w:val="single" w:color="999999" w:sz="4"/>
               <w:left w:val="single" w:color="999999" w:sz="4"/>
@@ -528,7 +399,7 @@
         </w:tc>
         <w:tc>
           <w:tcPr>
-            <w:tcW w:type="dxa" w:w="1784"/>
+            <w:tcW w:type="dxa" w:w="1965"/>
             <w:tcBorders>
               <w:top w:val="single" w:color="999999" w:sz="4"/>
               <w:left w:val="single" w:color="999999" w:sz="4"/>
@@ -563,37 +434,7 @@
         </w:trPr>
         <w:tc>
           <w:tcPr>
-            <w:tcW w:type="dxa" w:w="1632"/>
-            <w:tcBorders>
-              <w:top w:val="single" w:color="999999" w:sz="4"/>
-              <w:left w:val="single" w:color="999999" w:sz="4"/>
-              <w:bottom w:val="single" w:color="999999" w:sz="4"/>
-              <w:right w:val="single" w:color="999999" w:sz="4"/>
-            </w:tcBorders>
-            <w:shd w:fill="FFFFFF" w:color="auto" w:val="clear"/>
-            <w:tcMar>
-              <w:top w:type="dxa" w:w="60"/>
-              <w:left w:type="dxa" w:w="100"/>
-              <w:bottom w:type="dxa" w:w="60"/>
-              <w:right w:type="dxa" w:w="100"/>
-            </w:tcMar>
-          </w:tcPr>
-          <w:p>
-            <w:r>
-              <w:rPr>
-                <w:b w:val="false"/>
-                <w:bCs w:val="false"/>
-                <w:color w:val="000000"/>
-                <w:sz w:val="19"/>
-                <w:szCs w:val="19"/>
-              </w:rPr>
-              <w:t xml:space="preserve">Pendiente</w:t>
-            </w:r>
-          </w:p>
-        </w:tc>
-        <w:tc>
-          <w:tcPr>
-            <w:tcW w:type="dxa" w:w="1484"/>
+            <w:tcW w:type="dxa" w:w="1963"/>
             <w:tcBorders>
               <w:top w:val="single" w:color="999999" w:sz="4"/>
               <w:left w:val="single" w:color="999999" w:sz="4"/>
@@ -623,7 +464,7 @@
         </w:tc>
         <w:tc>
           <w:tcPr>
-            <w:tcW w:type="dxa" w:w="6235"/>
+            <w:tcW w:type="dxa" w:w="6872"/>
             <w:tcBorders>
               <w:top w:val="single" w:color="999999" w:sz="4"/>
               <w:left w:val="single" w:color="999999" w:sz="4"/>
@@ -653,7 +494,7 @@
         </w:tc>
         <w:tc>
           <w:tcPr>
-            <w:tcW w:type="dxa" w:w="3265"/>
+            <w:tcW w:type="dxa" w:w="3600"/>
             <w:tcBorders>
               <w:top w:val="single" w:color="999999" w:sz="4"/>
               <w:left w:val="single" w:color="999999" w:sz="4"/>
@@ -683,7 +524,7 @@
         </w:tc>
         <w:tc>
           <w:tcPr>
-            <w:tcW w:type="dxa" w:w="1784"/>
+            <w:tcW w:type="dxa" w:w="1965"/>
             <w:tcBorders>
               <w:top w:val="single" w:color="999999" w:sz="4"/>
               <w:left w:val="single" w:color="999999" w:sz="4"/>
@@ -718,37 +559,7 @@
         </w:trPr>
         <w:tc>
           <w:tcPr>
-            <w:tcW w:type="dxa" w:w="1632"/>
-            <w:tcBorders>
-              <w:top w:val="single" w:color="999999" w:sz="4"/>
-              <w:left w:val="single" w:color="999999" w:sz="4"/>
-              <w:bottom w:val="single" w:color="999999" w:sz="4"/>
-              <w:right w:val="single" w:color="999999" w:sz="4"/>
-            </w:tcBorders>
-            <w:shd w:fill="FFFFFF" w:color="auto" w:val="clear"/>
-            <w:tcMar>
-              <w:top w:type="dxa" w:w="60"/>
-              <w:left w:type="dxa" w:w="100"/>
-              <w:bottom w:type="dxa" w:w="60"/>
-              <w:right w:type="dxa" w:w="100"/>
-            </w:tcMar>
-          </w:tcPr>
-          <w:p>
-            <w:r>
-              <w:rPr>
-                <w:b w:val="false"/>
-                <w:bCs w:val="false"/>
-                <w:color w:val="000000"/>
-                <w:sz w:val="19"/>
-                <w:szCs w:val="19"/>
-              </w:rPr>
-              <w:t xml:space="preserve">Pendiente</w:t>
-            </w:r>
-          </w:p>
-        </w:tc>
-        <w:tc>
-          <w:tcPr>
-            <w:tcW w:type="dxa" w:w="1484"/>
+            <w:tcW w:type="dxa" w:w="1963"/>
             <w:tcBorders>
               <w:top w:val="single" w:color="999999" w:sz="4"/>
               <w:left w:val="single" w:color="999999" w:sz="4"/>
@@ -778,7 +589,7 @@
         </w:tc>
         <w:tc>
           <w:tcPr>
-            <w:tcW w:type="dxa" w:w="6235"/>
+            <w:tcW w:type="dxa" w:w="6872"/>
             <w:tcBorders>
               <w:top w:val="single" w:color="999999" w:sz="4"/>
               <w:left w:val="single" w:color="999999" w:sz="4"/>
@@ -808,7 +619,7 @@
         </w:tc>
         <w:tc>
           <w:tcPr>
-            <w:tcW w:type="dxa" w:w="3265"/>
+            <w:tcW w:type="dxa" w:w="3600"/>
             <w:tcBorders>
               <w:top w:val="single" w:color="999999" w:sz="4"/>
               <w:left w:val="single" w:color="999999" w:sz="4"/>
@@ -838,7 +649,7 @@
         </w:tc>
         <w:tc>
           <w:tcPr>
-            <w:tcW w:type="dxa" w:w="1784"/>
+            <w:tcW w:type="dxa" w:w="1965"/>
             <w:tcBorders>
               <w:top w:val="single" w:color="999999" w:sz="4"/>
               <w:left w:val="single" w:color="999999" w:sz="4"/>
@@ -873,37 +684,7 @@
         </w:trPr>
         <w:tc>
           <w:tcPr>
-            <w:tcW w:type="dxa" w:w="1632"/>
-            <w:tcBorders>
-              <w:top w:val="single" w:color="999999" w:sz="4"/>
-              <w:left w:val="single" w:color="999999" w:sz="4"/>
-              <w:bottom w:val="single" w:color="999999" w:sz="4"/>
-              <w:right w:val="single" w:color="999999" w:sz="4"/>
-            </w:tcBorders>
-            <w:shd w:fill="FFFFFF" w:color="auto" w:val="clear"/>
-            <w:tcMar>
-              <w:top w:type="dxa" w:w="60"/>
-              <w:left w:type="dxa" w:w="100"/>
-              <w:bottom w:type="dxa" w:w="60"/>
-              <w:right w:type="dxa" w:w="100"/>
-            </w:tcMar>
-          </w:tcPr>
-          <w:p>
-            <w:r>
-              <w:rPr>
-                <w:b w:val="false"/>
-                <w:bCs w:val="false"/>
-                <w:color w:val="000000"/>
-                <w:sz w:val="19"/>
-                <w:szCs w:val="19"/>
-              </w:rPr>
-              <w:t xml:space="preserve">Pendiente</w:t>
-            </w:r>
-          </w:p>
-        </w:tc>
-        <w:tc>
-          <w:tcPr>
-            <w:tcW w:type="dxa" w:w="1484"/>
+            <w:tcW w:type="dxa" w:w="1963"/>
             <w:tcBorders>
               <w:top w:val="single" w:color="999999" w:sz="4"/>
               <w:left w:val="single" w:color="999999" w:sz="4"/>
@@ -933,7 +714,7 @@
         </w:tc>
         <w:tc>
           <w:tcPr>
-            <w:tcW w:type="dxa" w:w="6235"/>
+            <w:tcW w:type="dxa" w:w="6872"/>
             <w:tcBorders>
               <w:top w:val="single" w:color="999999" w:sz="4"/>
               <w:left w:val="single" w:color="999999" w:sz="4"/>
@@ -963,7 +744,7 @@
         </w:tc>
         <w:tc>
           <w:tcPr>
-            <w:tcW w:type="dxa" w:w="3265"/>
+            <w:tcW w:type="dxa" w:w="3600"/>
             <w:tcBorders>
               <w:top w:val="single" w:color="999999" w:sz="4"/>
               <w:left w:val="single" w:color="999999" w:sz="4"/>
@@ -993,7 +774,7 @@
         </w:tc>
         <w:tc>
           <w:tcPr>
-            <w:tcW w:type="dxa" w:w="1784"/>
+            <w:tcW w:type="dxa" w:w="1965"/>
             <w:tcBorders>
               <w:top w:val="single" w:color="999999" w:sz="4"/>
               <w:left w:val="single" w:color="999999" w:sz="4"/>
@@ -1045,11 +826,10 @@
         </w:tblBorders>
       </w:tblPr>
       <w:tblGrid>
-        <w:gridCol w:w="1632"/>
-        <w:gridCol w:w="1484"/>
-        <w:gridCol w:w="6235"/>
-        <w:gridCol w:w="3265"/>
-        <w:gridCol w:w="1784"/>
+        <w:gridCol w:w="1963"/>
+        <w:gridCol w:w="6872"/>
+        <w:gridCol w:w="3600"/>
+        <w:gridCol w:w="1965"/>
       </w:tblGrid>
       <w:tr>
         <w:trPr>
@@ -1057,7 +837,7 @@
         </w:trPr>
         <w:tc>
           <w:tcPr>
-            <w:tcW w:type="dxa" w:w="1632"/>
+            <w:tcW w:type="dxa" w:w="1963"/>
             <w:tcBorders>
               <w:top w:val="single" w:color="999999" w:sz="4"/>
               <w:left w:val="single" w:color="999999" w:sz="4"/>
@@ -1081,13 +861,13 @@
                 <w:sz w:val="19"/>
                 <w:szCs w:val="19"/>
               </w:rPr>
-              <w:t xml:space="preserve">Estado</w:t>
-            </w:r>
-          </w:p>
-        </w:tc>
-        <w:tc>
-          <w:tcPr>
-            <w:tcW w:type="dxa" w:w="1484"/>
+              <w:t xml:space="preserve">ID</w:t>
+            </w:r>
+          </w:p>
+        </w:tc>
+        <w:tc>
+          <w:tcPr>
+            <w:tcW w:type="dxa" w:w="6872"/>
             <w:tcBorders>
               <w:top w:val="single" w:color="999999" w:sz="4"/>
               <w:left w:val="single" w:color="999999" w:sz="4"/>
@@ -1111,13 +891,13 @@
                 <w:sz w:val="19"/>
                 <w:szCs w:val="19"/>
               </w:rPr>
-              <w:t xml:space="preserve">ID</w:t>
-            </w:r>
-          </w:p>
-        </w:tc>
-        <w:tc>
-          <w:tcPr>
-            <w:tcW w:type="dxa" w:w="6235"/>
+              <w:t xml:space="preserve">Funcionalidad</w:t>
+            </w:r>
+          </w:p>
+        </w:tc>
+        <w:tc>
+          <w:tcPr>
+            <w:tcW w:type="dxa" w:w="3600"/>
             <w:tcBorders>
               <w:top w:val="single" w:color="999999" w:sz="4"/>
               <w:left w:val="single" w:color="999999" w:sz="4"/>
@@ -1141,43 +921,13 @@
                 <w:sz w:val="19"/>
                 <w:szCs w:val="19"/>
               </w:rPr>
-              <w:t xml:space="preserve">Funcionalidad</w:t>
-            </w:r>
-          </w:p>
-        </w:tc>
-        <w:tc>
-          <w:tcPr>
-            <w:tcW w:type="dxa" w:w="3265"/>
-            <w:tcBorders>
-              <w:top w:val="single" w:color="999999" w:sz="4"/>
-              <w:left w:val="single" w:color="999999" w:sz="4"/>
-              <w:bottom w:val="single" w:color="999999" w:sz="4"/>
-              <w:right w:val="single" w:color="999999" w:sz="4"/>
-            </w:tcBorders>
-            <w:shd w:fill="1B5E3A" w:color="auto" w:val="clear"/>
-            <w:tcMar>
-              <w:top w:type="dxa" w:w="60"/>
-              <w:left w:type="dxa" w:w="100"/>
-              <w:bottom w:type="dxa" w:w="60"/>
-              <w:right w:type="dxa" w:w="100"/>
-            </w:tcMar>
-          </w:tcPr>
-          <w:p>
-            <w:r>
-              <w:rPr>
-                <w:b/>
-                <w:bCs/>
-                <w:color w:val="FFFFFF"/>
-                <w:sz w:val="19"/>
-                <w:szCs w:val="19"/>
-              </w:rPr>
               <w:t xml:space="preserve">Actor</w:t>
             </w:r>
           </w:p>
         </w:tc>
         <w:tc>
           <w:tcPr>
-            <w:tcW w:type="dxa" w:w="1784"/>
+            <w:tcW w:type="dxa" w:w="1965"/>
             <w:tcBorders>
               <w:top w:val="single" w:color="999999" w:sz="4"/>
               <w:left w:val="single" w:color="999999" w:sz="4"/>
@@ -1212,37 +962,7 @@
         </w:trPr>
         <w:tc>
           <w:tcPr>
-            <w:tcW w:type="dxa" w:w="1632"/>
-            <w:tcBorders>
-              <w:top w:val="single" w:color="999999" w:sz="4"/>
-              <w:left w:val="single" w:color="999999" w:sz="4"/>
-              <w:bottom w:val="single" w:color="999999" w:sz="4"/>
-              <w:right w:val="single" w:color="999999" w:sz="4"/>
-            </w:tcBorders>
-            <w:shd w:fill="FFFFFF" w:color="auto" w:val="clear"/>
-            <w:tcMar>
-              <w:top w:type="dxa" w:w="60"/>
-              <w:left w:type="dxa" w:w="100"/>
-              <w:bottom w:type="dxa" w:w="60"/>
-              <w:right w:type="dxa" w:w="100"/>
-            </w:tcMar>
-          </w:tcPr>
-          <w:p>
-            <w:r>
-              <w:rPr>
-                <w:b w:val="false"/>
-                <w:bCs w:val="false"/>
-                <w:color w:val="000000"/>
-                <w:sz w:val="19"/>
-                <w:szCs w:val="19"/>
-              </w:rPr>
-              <w:t xml:space="preserve">Pendiente</w:t>
-            </w:r>
-          </w:p>
-        </w:tc>
-        <w:tc>
-          <w:tcPr>
-            <w:tcW w:type="dxa" w:w="1484"/>
+            <w:tcW w:type="dxa" w:w="1963"/>
             <w:tcBorders>
               <w:top w:val="single" w:color="999999" w:sz="4"/>
               <w:left w:val="single" w:color="999999" w:sz="4"/>
@@ -1272,7 +992,7 @@
         </w:tc>
         <w:tc>
           <w:tcPr>
-            <w:tcW w:type="dxa" w:w="6235"/>
+            <w:tcW w:type="dxa" w:w="6872"/>
             <w:tcBorders>
               <w:top w:val="single" w:color="999999" w:sz="4"/>
               <w:left w:val="single" w:color="999999" w:sz="4"/>
@@ -1302,7 +1022,7 @@
         </w:tc>
         <w:tc>
           <w:tcPr>
-            <w:tcW w:type="dxa" w:w="3265"/>
+            <w:tcW w:type="dxa" w:w="3600"/>
             <w:tcBorders>
               <w:top w:val="single" w:color="999999" w:sz="4"/>
               <w:left w:val="single" w:color="999999" w:sz="4"/>
@@ -1332,7 +1052,7 @@
         </w:tc>
         <w:tc>
           <w:tcPr>
-            <w:tcW w:type="dxa" w:w="1784"/>
+            <w:tcW w:type="dxa" w:w="1965"/>
             <w:tcBorders>
               <w:top w:val="single" w:color="999999" w:sz="4"/>
               <w:left w:val="single" w:color="999999" w:sz="4"/>
@@ -1367,37 +1087,7 @@
         </w:trPr>
         <w:tc>
           <w:tcPr>
-            <w:tcW w:type="dxa" w:w="1632"/>
-            <w:tcBorders>
-              <w:top w:val="single" w:color="999999" w:sz="4"/>
-              <w:left w:val="single" w:color="999999" w:sz="4"/>
-              <w:bottom w:val="single" w:color="999999" w:sz="4"/>
-              <w:right w:val="single" w:color="999999" w:sz="4"/>
-            </w:tcBorders>
-            <w:shd w:fill="FFFFFF" w:color="auto" w:val="clear"/>
-            <w:tcMar>
-              <w:top w:type="dxa" w:w="60"/>
-              <w:left w:type="dxa" w:w="100"/>
-              <w:bottom w:type="dxa" w:w="60"/>
-              <w:right w:type="dxa" w:w="100"/>
-            </w:tcMar>
-          </w:tcPr>
-          <w:p>
-            <w:r>
-              <w:rPr>
-                <w:b w:val="false"/>
-                <w:bCs w:val="false"/>
-                <w:color w:val="000000"/>
-                <w:sz w:val="19"/>
-                <w:szCs w:val="19"/>
-              </w:rPr>
-              <w:t xml:space="preserve">Pendiente</w:t>
-            </w:r>
-          </w:p>
-        </w:tc>
-        <w:tc>
-          <w:tcPr>
-            <w:tcW w:type="dxa" w:w="1484"/>
+            <w:tcW w:type="dxa" w:w="1963"/>
             <w:tcBorders>
               <w:top w:val="single" w:color="999999" w:sz="4"/>
               <w:left w:val="single" w:color="999999" w:sz="4"/>
@@ -1427,7 +1117,7 @@
         </w:tc>
         <w:tc>
           <w:tcPr>
-            <w:tcW w:type="dxa" w:w="6235"/>
+            <w:tcW w:type="dxa" w:w="6872"/>
             <w:tcBorders>
               <w:top w:val="single" w:color="999999" w:sz="4"/>
               <w:left w:val="single" w:color="999999" w:sz="4"/>
@@ -1457,7 +1147,7 @@
         </w:tc>
         <w:tc>
           <w:tcPr>
-            <w:tcW w:type="dxa" w:w="3265"/>
+            <w:tcW w:type="dxa" w:w="3600"/>
             <w:tcBorders>
               <w:top w:val="single" w:color="999999" w:sz="4"/>
               <w:left w:val="single" w:color="999999" w:sz="4"/>
@@ -1487,7 +1177,7 @@
         </w:tc>
         <w:tc>
           <w:tcPr>
-            <w:tcW w:type="dxa" w:w="1784"/>
+            <w:tcW w:type="dxa" w:w="1965"/>
             <w:tcBorders>
               <w:top w:val="single" w:color="999999" w:sz="4"/>
               <w:left w:val="single" w:color="999999" w:sz="4"/>
@@ -1522,37 +1212,7 @@
         </w:trPr>
         <w:tc>
           <w:tcPr>
-            <w:tcW w:type="dxa" w:w="1632"/>
-            <w:tcBorders>
-              <w:top w:val="single" w:color="999999" w:sz="4"/>
-              <w:left w:val="single" w:color="999999" w:sz="4"/>
-              <w:bottom w:val="single" w:color="999999" w:sz="4"/>
-              <w:right w:val="single" w:color="999999" w:sz="4"/>
-            </w:tcBorders>
-            <w:shd w:fill="FFFFFF" w:color="auto" w:val="clear"/>
-            <w:tcMar>
-              <w:top w:type="dxa" w:w="60"/>
-              <w:left w:type="dxa" w:w="100"/>
-              <w:bottom w:type="dxa" w:w="60"/>
-              <w:right w:type="dxa" w:w="100"/>
-            </w:tcMar>
-          </w:tcPr>
-          <w:p>
-            <w:r>
-              <w:rPr>
-                <w:b w:val="false"/>
-                <w:bCs w:val="false"/>
-                <w:color w:val="000000"/>
-                <w:sz w:val="19"/>
-                <w:szCs w:val="19"/>
-              </w:rPr>
-              <w:t xml:space="preserve">Pendiente</w:t>
-            </w:r>
-          </w:p>
-        </w:tc>
-        <w:tc>
-          <w:tcPr>
-            <w:tcW w:type="dxa" w:w="1484"/>
+            <w:tcW w:type="dxa" w:w="1963"/>
             <w:tcBorders>
               <w:top w:val="single" w:color="999999" w:sz="4"/>
               <w:left w:val="single" w:color="999999" w:sz="4"/>
@@ -1582,7 +1242,7 @@
         </w:tc>
         <w:tc>
           <w:tcPr>
-            <w:tcW w:type="dxa" w:w="6235"/>
+            <w:tcW w:type="dxa" w:w="6872"/>
             <w:tcBorders>
               <w:top w:val="single" w:color="999999" w:sz="4"/>
               <w:left w:val="single" w:color="999999" w:sz="4"/>
@@ -1612,7 +1272,7 @@
         </w:tc>
         <w:tc>
           <w:tcPr>
-            <w:tcW w:type="dxa" w:w="3265"/>
+            <w:tcW w:type="dxa" w:w="3600"/>
             <w:tcBorders>
               <w:top w:val="single" w:color="999999" w:sz="4"/>
               <w:left w:val="single" w:color="999999" w:sz="4"/>
@@ -1642,7 +1302,7 @@
         </w:tc>
         <w:tc>
           <w:tcPr>
-            <w:tcW w:type="dxa" w:w="1784"/>
+            <w:tcW w:type="dxa" w:w="1965"/>
             <w:tcBorders>
               <w:top w:val="single" w:color="999999" w:sz="4"/>
               <w:left w:val="single" w:color="999999" w:sz="4"/>
@@ -1677,37 +1337,7 @@
         </w:trPr>
         <w:tc>
           <w:tcPr>
-            <w:tcW w:type="dxa" w:w="1632"/>
-            <w:tcBorders>
-              <w:top w:val="single" w:color="999999" w:sz="4"/>
-              <w:left w:val="single" w:color="999999" w:sz="4"/>
-              <w:bottom w:val="single" w:color="999999" w:sz="4"/>
-              <w:right w:val="single" w:color="999999" w:sz="4"/>
-            </w:tcBorders>
-            <w:shd w:fill="FFFFFF" w:color="auto" w:val="clear"/>
-            <w:tcMar>
-              <w:top w:type="dxa" w:w="60"/>
-              <w:left w:type="dxa" w:w="100"/>
-              <w:bottom w:type="dxa" w:w="60"/>
-              <w:right w:type="dxa" w:w="100"/>
-            </w:tcMar>
-          </w:tcPr>
-          <w:p>
-            <w:r>
-              <w:rPr>
-                <w:b w:val="false"/>
-                <w:bCs w:val="false"/>
-                <w:color w:val="000000"/>
-                <w:sz w:val="19"/>
-                <w:szCs w:val="19"/>
-              </w:rPr>
-              <w:t xml:space="preserve">Pendiente</w:t>
-            </w:r>
-          </w:p>
-        </w:tc>
-        <w:tc>
-          <w:tcPr>
-            <w:tcW w:type="dxa" w:w="1484"/>
+            <w:tcW w:type="dxa" w:w="1963"/>
             <w:tcBorders>
               <w:top w:val="single" w:color="999999" w:sz="4"/>
               <w:left w:val="single" w:color="999999" w:sz="4"/>
@@ -1737,7 +1367,7 @@
         </w:tc>
         <w:tc>
           <w:tcPr>
-            <w:tcW w:type="dxa" w:w="6235"/>
+            <w:tcW w:type="dxa" w:w="6872"/>
             <w:tcBorders>
               <w:top w:val="single" w:color="999999" w:sz="4"/>
               <w:left w:val="single" w:color="999999" w:sz="4"/>
@@ -1767,7 +1397,7 @@
         </w:tc>
         <w:tc>
           <w:tcPr>
-            <w:tcW w:type="dxa" w:w="3265"/>
+            <w:tcW w:type="dxa" w:w="3600"/>
             <w:tcBorders>
               <w:top w:val="single" w:color="999999" w:sz="4"/>
               <w:left w:val="single" w:color="999999" w:sz="4"/>
@@ -1797,7 +1427,7 @@
         </w:tc>
         <w:tc>
           <w:tcPr>
-            <w:tcW w:type="dxa" w:w="1784"/>
+            <w:tcW w:type="dxa" w:w="1965"/>
             <w:tcBorders>
               <w:top w:val="single" w:color="999999" w:sz="4"/>
               <w:left w:val="single" w:color="999999" w:sz="4"/>
@@ -1832,37 +1462,7 @@
         </w:trPr>
         <w:tc>
           <w:tcPr>
-            <w:tcW w:type="dxa" w:w="1632"/>
-            <w:tcBorders>
-              <w:top w:val="single" w:color="999999" w:sz="4"/>
-              <w:left w:val="single" w:color="999999" w:sz="4"/>
-              <w:bottom w:val="single" w:color="999999" w:sz="4"/>
-              <w:right w:val="single" w:color="999999" w:sz="4"/>
-            </w:tcBorders>
-            <w:shd w:fill="FFFFFF" w:color="auto" w:val="clear"/>
-            <w:tcMar>
-              <w:top w:type="dxa" w:w="60"/>
-              <w:left w:type="dxa" w:w="100"/>
-              <w:bottom w:type="dxa" w:w="60"/>
-              <w:right w:type="dxa" w:w="100"/>
-            </w:tcMar>
-          </w:tcPr>
-          <w:p>
-            <w:r>
-              <w:rPr>
-                <w:b w:val="false"/>
-                <w:bCs w:val="false"/>
-                <w:color w:val="000000"/>
-                <w:sz w:val="19"/>
-                <w:szCs w:val="19"/>
-              </w:rPr>
-              <w:t xml:space="preserve">Pendiente</w:t>
-            </w:r>
-          </w:p>
-        </w:tc>
-        <w:tc>
-          <w:tcPr>
-            <w:tcW w:type="dxa" w:w="1484"/>
+            <w:tcW w:type="dxa" w:w="1963"/>
             <w:tcBorders>
               <w:top w:val="single" w:color="999999" w:sz="4"/>
               <w:left w:val="single" w:color="999999" w:sz="4"/>
@@ -1892,7 +1492,7 @@
         </w:tc>
         <w:tc>
           <w:tcPr>
-            <w:tcW w:type="dxa" w:w="6235"/>
+            <w:tcW w:type="dxa" w:w="6872"/>
             <w:tcBorders>
               <w:top w:val="single" w:color="999999" w:sz="4"/>
               <w:left w:val="single" w:color="999999" w:sz="4"/>
@@ -1922,7 +1522,7 @@
         </w:tc>
         <w:tc>
           <w:tcPr>
-            <w:tcW w:type="dxa" w:w="3265"/>
+            <w:tcW w:type="dxa" w:w="3600"/>
             <w:tcBorders>
               <w:top w:val="single" w:color="999999" w:sz="4"/>
               <w:left w:val="single" w:color="999999" w:sz="4"/>
@@ -1952,7 +1552,7 @@
         </w:tc>
         <w:tc>
           <w:tcPr>
-            <w:tcW w:type="dxa" w:w="1784"/>
+            <w:tcW w:type="dxa" w:w="1965"/>
             <w:tcBorders>
               <w:top w:val="single" w:color="999999" w:sz="4"/>
               <w:left w:val="single" w:color="999999" w:sz="4"/>
@@ -2004,11 +1604,10 @@
         </w:tblBorders>
       </w:tblPr>
       <w:tblGrid>
-        <w:gridCol w:w="1632"/>
-        <w:gridCol w:w="1484"/>
-        <w:gridCol w:w="6235"/>
-        <w:gridCol w:w="3265"/>
-        <w:gridCol w:w="1784"/>
+        <w:gridCol w:w="1963"/>
+        <w:gridCol w:w="6872"/>
+        <w:gridCol w:w="3600"/>
+        <w:gridCol w:w="1965"/>
       </w:tblGrid>
       <w:tr>
         <w:trPr>
@@ -2016,7 +1615,7 @@
         </w:trPr>
         <w:tc>
           <w:tcPr>
-            <w:tcW w:type="dxa" w:w="1632"/>
+            <w:tcW w:type="dxa" w:w="1963"/>
             <w:tcBorders>
               <w:top w:val="single" w:color="999999" w:sz="4"/>
               <w:left w:val="single" w:color="999999" w:sz="4"/>
@@ -2040,13 +1639,13 @@
                 <w:sz w:val="19"/>
                 <w:szCs w:val="19"/>
               </w:rPr>
-              <w:t xml:space="preserve">Estado</w:t>
-            </w:r>
-          </w:p>
-        </w:tc>
-        <w:tc>
-          <w:tcPr>
-            <w:tcW w:type="dxa" w:w="1484"/>
+              <w:t xml:space="preserve">ID</w:t>
+            </w:r>
+          </w:p>
+        </w:tc>
+        <w:tc>
+          <w:tcPr>
+            <w:tcW w:type="dxa" w:w="6872"/>
             <w:tcBorders>
               <w:top w:val="single" w:color="999999" w:sz="4"/>
               <w:left w:val="single" w:color="999999" w:sz="4"/>
@@ -2070,13 +1669,13 @@
                 <w:sz w:val="19"/>
                 <w:szCs w:val="19"/>
               </w:rPr>
-              <w:t xml:space="preserve">ID</w:t>
-            </w:r>
-          </w:p>
-        </w:tc>
-        <w:tc>
-          <w:tcPr>
-            <w:tcW w:type="dxa" w:w="6235"/>
+              <w:t xml:space="preserve">Funcionalidad</w:t>
+            </w:r>
+          </w:p>
+        </w:tc>
+        <w:tc>
+          <w:tcPr>
+            <w:tcW w:type="dxa" w:w="3600"/>
             <w:tcBorders>
               <w:top w:val="single" w:color="999999" w:sz="4"/>
               <w:left w:val="single" w:color="999999" w:sz="4"/>
@@ -2100,43 +1699,13 @@
                 <w:sz w:val="19"/>
                 <w:szCs w:val="19"/>
               </w:rPr>
-              <w:t xml:space="preserve">Funcionalidad</w:t>
-            </w:r>
-          </w:p>
-        </w:tc>
-        <w:tc>
-          <w:tcPr>
-            <w:tcW w:type="dxa" w:w="3265"/>
-            <w:tcBorders>
-              <w:top w:val="single" w:color="999999" w:sz="4"/>
-              <w:left w:val="single" w:color="999999" w:sz="4"/>
-              <w:bottom w:val="single" w:color="999999" w:sz="4"/>
-              <w:right w:val="single" w:color="999999" w:sz="4"/>
-            </w:tcBorders>
-            <w:shd w:fill="1B5E3A" w:color="auto" w:val="clear"/>
-            <w:tcMar>
-              <w:top w:type="dxa" w:w="60"/>
-              <w:left w:type="dxa" w:w="100"/>
-              <w:bottom w:type="dxa" w:w="60"/>
-              <w:right w:type="dxa" w:w="100"/>
-            </w:tcMar>
-          </w:tcPr>
-          <w:p>
-            <w:r>
-              <w:rPr>
-                <w:b/>
-                <w:bCs/>
-                <w:color w:val="FFFFFF"/>
-                <w:sz w:val="19"/>
-                <w:szCs w:val="19"/>
-              </w:rPr>
               <w:t xml:space="preserve">Actor</w:t>
             </w:r>
           </w:p>
         </w:tc>
         <w:tc>
           <w:tcPr>
-            <w:tcW w:type="dxa" w:w="1784"/>
+            <w:tcW w:type="dxa" w:w="1965"/>
             <w:tcBorders>
               <w:top w:val="single" w:color="999999" w:sz="4"/>
               <w:left w:val="single" w:color="999999" w:sz="4"/>
@@ -2171,37 +1740,7 @@
         </w:trPr>
         <w:tc>
           <w:tcPr>
-            <w:tcW w:type="dxa" w:w="1632"/>
-            <w:tcBorders>
-              <w:top w:val="single" w:color="999999" w:sz="4"/>
-              <w:left w:val="single" w:color="999999" w:sz="4"/>
-              <w:bottom w:val="single" w:color="999999" w:sz="4"/>
-              <w:right w:val="single" w:color="999999" w:sz="4"/>
-            </w:tcBorders>
-            <w:shd w:fill="FFFFFF" w:color="auto" w:val="clear"/>
-            <w:tcMar>
-              <w:top w:type="dxa" w:w="60"/>
-              <w:left w:type="dxa" w:w="100"/>
-              <w:bottom w:type="dxa" w:w="60"/>
-              <w:right w:type="dxa" w:w="100"/>
-            </w:tcMar>
-          </w:tcPr>
-          <w:p>
-            <w:r>
-              <w:rPr>
-                <w:b w:val="false"/>
-                <w:bCs w:val="false"/>
-                <w:color w:val="000000"/>
-                <w:sz w:val="19"/>
-                <w:szCs w:val="19"/>
-              </w:rPr>
-              <w:t xml:space="preserve">Pendiente</w:t>
-            </w:r>
-          </w:p>
-        </w:tc>
-        <w:tc>
-          <w:tcPr>
-            <w:tcW w:type="dxa" w:w="1484"/>
+            <w:tcW w:type="dxa" w:w="1963"/>
             <w:tcBorders>
               <w:top w:val="single" w:color="999999" w:sz="4"/>
               <w:left w:val="single" w:color="999999" w:sz="4"/>
@@ -2231,7 +1770,7 @@
         </w:tc>
         <w:tc>
           <w:tcPr>
-            <w:tcW w:type="dxa" w:w="6235"/>
+            <w:tcW w:type="dxa" w:w="6872"/>
             <w:tcBorders>
               <w:top w:val="single" w:color="999999" w:sz="4"/>
               <w:left w:val="single" w:color="999999" w:sz="4"/>
@@ -2261,7 +1800,7 @@
         </w:tc>
         <w:tc>
           <w:tcPr>
-            <w:tcW w:type="dxa" w:w="3265"/>
+            <w:tcW w:type="dxa" w:w="3600"/>
             <w:tcBorders>
               <w:top w:val="single" w:color="999999" w:sz="4"/>
               <w:left w:val="single" w:color="999999" w:sz="4"/>
@@ -2291,7 +1830,7 @@
         </w:tc>
         <w:tc>
           <w:tcPr>
-            <w:tcW w:type="dxa" w:w="1784"/>
+            <w:tcW w:type="dxa" w:w="1965"/>
             <w:tcBorders>
               <w:top w:val="single" w:color="999999" w:sz="4"/>
               <w:left w:val="single" w:color="999999" w:sz="4"/>
@@ -2326,37 +1865,7 @@
         </w:trPr>
         <w:tc>
           <w:tcPr>
-            <w:tcW w:type="dxa" w:w="1632"/>
-            <w:tcBorders>
-              <w:top w:val="single" w:color="999999" w:sz="4"/>
-              <w:left w:val="single" w:color="999999" w:sz="4"/>
-              <w:bottom w:val="single" w:color="999999" w:sz="4"/>
-              <w:right w:val="single" w:color="999999" w:sz="4"/>
-            </w:tcBorders>
-            <w:shd w:fill="FFFFFF" w:color="auto" w:val="clear"/>
-            <w:tcMar>
-              <w:top w:type="dxa" w:w="60"/>
-              <w:left w:type="dxa" w:w="100"/>
-              <w:bottom w:type="dxa" w:w="60"/>
-              <w:right w:type="dxa" w:w="100"/>
-            </w:tcMar>
-          </w:tcPr>
-          <w:p>
-            <w:r>
-              <w:rPr>
-                <w:b w:val="false"/>
-                <w:bCs w:val="false"/>
-                <w:color w:val="000000"/>
-                <w:sz w:val="19"/>
-                <w:szCs w:val="19"/>
-              </w:rPr>
-              <w:t xml:space="preserve">Pendiente</w:t>
-            </w:r>
-          </w:p>
-        </w:tc>
-        <w:tc>
-          <w:tcPr>
-            <w:tcW w:type="dxa" w:w="1484"/>
+            <w:tcW w:type="dxa" w:w="1963"/>
             <w:tcBorders>
               <w:top w:val="single" w:color="999999" w:sz="4"/>
               <w:left w:val="single" w:color="999999" w:sz="4"/>
@@ -2386,7 +1895,7 @@
         </w:tc>
         <w:tc>
           <w:tcPr>
-            <w:tcW w:type="dxa" w:w="6235"/>
+            <w:tcW w:type="dxa" w:w="6872"/>
             <w:tcBorders>
               <w:top w:val="single" w:color="999999" w:sz="4"/>
               <w:left w:val="single" w:color="999999" w:sz="4"/>
@@ -2416,7 +1925,7 @@
         </w:tc>
         <w:tc>
           <w:tcPr>
-            <w:tcW w:type="dxa" w:w="3265"/>
+            <w:tcW w:type="dxa" w:w="3600"/>
             <w:tcBorders>
               <w:top w:val="single" w:color="999999" w:sz="4"/>
               <w:left w:val="single" w:color="999999" w:sz="4"/>
@@ -2446,7 +1955,7 @@
         </w:tc>
         <w:tc>
           <w:tcPr>
-            <w:tcW w:type="dxa" w:w="1784"/>
+            <w:tcW w:type="dxa" w:w="1965"/>
             <w:tcBorders>
               <w:top w:val="single" w:color="999999" w:sz="4"/>
               <w:left w:val="single" w:color="999999" w:sz="4"/>
@@ -2481,37 +1990,7 @@
         </w:trPr>
         <w:tc>
           <w:tcPr>
-            <w:tcW w:type="dxa" w:w="1632"/>
-            <w:tcBorders>
-              <w:top w:val="single" w:color="999999" w:sz="4"/>
-              <w:left w:val="single" w:color="999999" w:sz="4"/>
-              <w:bottom w:val="single" w:color="999999" w:sz="4"/>
-              <w:right w:val="single" w:color="999999" w:sz="4"/>
-            </w:tcBorders>
-            <w:shd w:fill="FFFFFF" w:color="auto" w:val="clear"/>
-            <w:tcMar>
-              <w:top w:type="dxa" w:w="60"/>
-              <w:left w:type="dxa" w:w="100"/>
-              <w:bottom w:type="dxa" w:w="60"/>
-              <w:right w:type="dxa" w:w="100"/>
-            </w:tcMar>
-          </w:tcPr>
-          <w:p>
-            <w:r>
-              <w:rPr>
-                <w:b w:val="false"/>
-                <w:bCs w:val="false"/>
-                <w:color w:val="000000"/>
-                <w:sz w:val="19"/>
-                <w:szCs w:val="19"/>
-              </w:rPr>
-              <w:t xml:space="preserve">Pendiente</w:t>
-            </w:r>
-          </w:p>
-        </w:tc>
-        <w:tc>
-          <w:tcPr>
-            <w:tcW w:type="dxa" w:w="1484"/>
+            <w:tcW w:type="dxa" w:w="1963"/>
             <w:tcBorders>
               <w:top w:val="single" w:color="999999" w:sz="4"/>
               <w:left w:val="single" w:color="999999" w:sz="4"/>
@@ -2541,7 +2020,7 @@
         </w:tc>
         <w:tc>
           <w:tcPr>
-            <w:tcW w:type="dxa" w:w="6235"/>
+            <w:tcW w:type="dxa" w:w="6872"/>
             <w:tcBorders>
               <w:top w:val="single" w:color="999999" w:sz="4"/>
               <w:left w:val="single" w:color="999999" w:sz="4"/>
@@ -2571,7 +2050,7 @@
         </w:tc>
         <w:tc>
           <w:tcPr>
-            <w:tcW w:type="dxa" w:w="3265"/>
+            <w:tcW w:type="dxa" w:w="3600"/>
             <w:tcBorders>
               <w:top w:val="single" w:color="999999" w:sz="4"/>
               <w:left w:val="single" w:color="999999" w:sz="4"/>
@@ -2601,7 +2080,7 @@
         </w:tc>
         <w:tc>
           <w:tcPr>
-            <w:tcW w:type="dxa" w:w="1784"/>
+            <w:tcW w:type="dxa" w:w="1965"/>
             <w:tcBorders>
               <w:top w:val="single" w:color="999999" w:sz="4"/>
               <w:left w:val="single" w:color="999999" w:sz="4"/>
@@ -2636,37 +2115,7 @@
         </w:trPr>
         <w:tc>
           <w:tcPr>
-            <w:tcW w:type="dxa" w:w="1632"/>
-            <w:tcBorders>
-              <w:top w:val="single" w:color="999999" w:sz="4"/>
-              <w:left w:val="single" w:color="999999" w:sz="4"/>
-              <w:bottom w:val="single" w:color="999999" w:sz="4"/>
-              <w:right w:val="single" w:color="999999" w:sz="4"/>
-            </w:tcBorders>
-            <w:shd w:fill="FFFFFF" w:color="auto" w:val="clear"/>
-            <w:tcMar>
-              <w:top w:type="dxa" w:w="60"/>
-              <w:left w:type="dxa" w:w="100"/>
-              <w:bottom w:type="dxa" w:w="60"/>
-              <w:right w:type="dxa" w:w="100"/>
-            </w:tcMar>
-          </w:tcPr>
-          <w:p>
-            <w:r>
-              <w:rPr>
-                <w:b w:val="false"/>
-                <w:bCs w:val="false"/>
-                <w:color w:val="000000"/>
-                <w:sz w:val="19"/>
-                <w:szCs w:val="19"/>
-              </w:rPr>
-              <w:t xml:space="preserve">Pendiente</w:t>
-            </w:r>
-          </w:p>
-        </w:tc>
-        <w:tc>
-          <w:tcPr>
-            <w:tcW w:type="dxa" w:w="1484"/>
+            <w:tcW w:type="dxa" w:w="1963"/>
             <w:tcBorders>
               <w:top w:val="single" w:color="999999" w:sz="4"/>
               <w:left w:val="single" w:color="999999" w:sz="4"/>
@@ -2696,7 +2145,7 @@
         </w:tc>
         <w:tc>
           <w:tcPr>
-            <w:tcW w:type="dxa" w:w="6235"/>
+            <w:tcW w:type="dxa" w:w="6872"/>
             <w:tcBorders>
               <w:top w:val="single" w:color="999999" w:sz="4"/>
               <w:left w:val="single" w:color="999999" w:sz="4"/>
@@ -2726,7 +2175,7 @@
         </w:tc>
         <w:tc>
           <w:tcPr>
-            <w:tcW w:type="dxa" w:w="3265"/>
+            <w:tcW w:type="dxa" w:w="3600"/>
             <w:tcBorders>
               <w:top w:val="single" w:color="999999" w:sz="4"/>
               <w:left w:val="single" w:color="999999" w:sz="4"/>
@@ -2756,7 +2205,7 @@
         </w:tc>
         <w:tc>
           <w:tcPr>
-            <w:tcW w:type="dxa" w:w="1784"/>
+            <w:tcW w:type="dxa" w:w="1965"/>
             <w:tcBorders>
               <w:top w:val="single" w:color="999999" w:sz="4"/>
               <w:left w:val="single" w:color="999999" w:sz="4"/>
@@ -2808,11 +2257,10 @@
         </w:tblBorders>
       </w:tblPr>
       <w:tblGrid>
-        <w:gridCol w:w="1632"/>
-        <w:gridCol w:w="1484"/>
-        <w:gridCol w:w="6235"/>
-        <w:gridCol w:w="3265"/>
-        <w:gridCol w:w="1784"/>
+        <w:gridCol w:w="1963"/>
+        <w:gridCol w:w="6872"/>
+        <w:gridCol w:w="3600"/>
+        <w:gridCol w:w="1965"/>
       </w:tblGrid>
       <w:tr>
         <w:trPr>
@@ -2820,7 +2268,7 @@
         </w:trPr>
         <w:tc>
           <w:tcPr>
-            <w:tcW w:type="dxa" w:w="1632"/>
+            <w:tcW w:type="dxa" w:w="1963"/>
             <w:tcBorders>
               <w:top w:val="single" w:color="999999" w:sz="4"/>
               <w:left w:val="single" w:color="999999" w:sz="4"/>
@@ -2844,13 +2292,13 @@
                 <w:sz w:val="19"/>
                 <w:szCs w:val="19"/>
               </w:rPr>
-              <w:t xml:space="preserve">Estado</w:t>
-            </w:r>
-          </w:p>
-        </w:tc>
-        <w:tc>
-          <w:tcPr>
-            <w:tcW w:type="dxa" w:w="1484"/>
+              <w:t xml:space="preserve">ID</w:t>
+            </w:r>
+          </w:p>
+        </w:tc>
+        <w:tc>
+          <w:tcPr>
+            <w:tcW w:type="dxa" w:w="6872"/>
             <w:tcBorders>
               <w:top w:val="single" w:color="999999" w:sz="4"/>
               <w:left w:val="single" w:color="999999" w:sz="4"/>
@@ -2874,13 +2322,13 @@
                 <w:sz w:val="19"/>
                 <w:szCs w:val="19"/>
               </w:rPr>
-              <w:t xml:space="preserve">ID</w:t>
-            </w:r>
-          </w:p>
-        </w:tc>
-        <w:tc>
-          <w:tcPr>
-            <w:tcW w:type="dxa" w:w="6235"/>
+              <w:t xml:space="preserve">Funcionalidad</w:t>
+            </w:r>
+          </w:p>
+        </w:tc>
+        <w:tc>
+          <w:tcPr>
+            <w:tcW w:type="dxa" w:w="3600"/>
             <w:tcBorders>
               <w:top w:val="single" w:color="999999" w:sz="4"/>
               <w:left w:val="single" w:color="999999" w:sz="4"/>
@@ -2904,43 +2352,13 @@
                 <w:sz w:val="19"/>
                 <w:szCs w:val="19"/>
               </w:rPr>
-              <w:t xml:space="preserve">Funcionalidad</w:t>
-            </w:r>
-          </w:p>
-        </w:tc>
-        <w:tc>
-          <w:tcPr>
-            <w:tcW w:type="dxa" w:w="3265"/>
-            <w:tcBorders>
-              <w:top w:val="single" w:color="999999" w:sz="4"/>
-              <w:left w:val="single" w:color="999999" w:sz="4"/>
-              <w:bottom w:val="single" w:color="999999" w:sz="4"/>
-              <w:right w:val="single" w:color="999999" w:sz="4"/>
-            </w:tcBorders>
-            <w:shd w:fill="1B5E3A" w:color="auto" w:val="clear"/>
-            <w:tcMar>
-              <w:top w:type="dxa" w:w="60"/>
-              <w:left w:type="dxa" w:w="100"/>
-              <w:bottom w:type="dxa" w:w="60"/>
-              <w:right w:type="dxa" w:w="100"/>
-            </w:tcMar>
-          </w:tcPr>
-          <w:p>
-            <w:r>
-              <w:rPr>
-                <w:b/>
-                <w:bCs/>
-                <w:color w:val="FFFFFF"/>
-                <w:sz w:val="19"/>
-                <w:szCs w:val="19"/>
-              </w:rPr>
               <w:t xml:space="preserve">Actor</w:t>
             </w:r>
           </w:p>
         </w:tc>
         <w:tc>
           <w:tcPr>
-            <w:tcW w:type="dxa" w:w="1784"/>
+            <w:tcW w:type="dxa" w:w="1965"/>
             <w:tcBorders>
               <w:top w:val="single" w:color="999999" w:sz="4"/>
               <w:left w:val="single" w:color="999999" w:sz="4"/>
@@ -2975,37 +2393,7 @@
         </w:trPr>
         <w:tc>
           <w:tcPr>
-            <w:tcW w:type="dxa" w:w="1632"/>
-            <w:tcBorders>
-              <w:top w:val="single" w:color="999999" w:sz="4"/>
-              <w:left w:val="single" w:color="999999" w:sz="4"/>
-              <w:bottom w:val="single" w:color="999999" w:sz="4"/>
-              <w:right w:val="single" w:color="999999" w:sz="4"/>
-            </w:tcBorders>
-            <w:shd w:fill="FFFFFF" w:color="auto" w:val="clear"/>
-            <w:tcMar>
-              <w:top w:type="dxa" w:w="60"/>
-              <w:left w:type="dxa" w:w="100"/>
-              <w:bottom w:type="dxa" w:w="60"/>
-              <w:right w:type="dxa" w:w="100"/>
-            </w:tcMar>
-          </w:tcPr>
-          <w:p>
-            <w:r>
-              <w:rPr>
-                <w:b w:val="false"/>
-                <w:bCs w:val="false"/>
-                <w:color w:val="000000"/>
-                <w:sz w:val="19"/>
-                <w:szCs w:val="19"/>
-              </w:rPr>
-              <w:t xml:space="preserve">Pendiente</w:t>
-            </w:r>
-          </w:p>
-        </w:tc>
-        <w:tc>
-          <w:tcPr>
-            <w:tcW w:type="dxa" w:w="1484"/>
+            <w:tcW w:type="dxa" w:w="1963"/>
             <w:tcBorders>
               <w:top w:val="single" w:color="999999" w:sz="4"/>
               <w:left w:val="single" w:color="999999" w:sz="4"/>
@@ -3035,7 +2423,7 @@
         </w:tc>
         <w:tc>
           <w:tcPr>
-            <w:tcW w:type="dxa" w:w="6235"/>
+            <w:tcW w:type="dxa" w:w="6872"/>
             <w:tcBorders>
               <w:top w:val="single" w:color="999999" w:sz="4"/>
               <w:left w:val="single" w:color="999999" w:sz="4"/>
@@ -3065,7 +2453,7 @@
         </w:tc>
         <w:tc>
           <w:tcPr>
-            <w:tcW w:type="dxa" w:w="3265"/>
+            <w:tcW w:type="dxa" w:w="3600"/>
             <w:tcBorders>
               <w:top w:val="single" w:color="999999" w:sz="4"/>
               <w:left w:val="single" w:color="999999" w:sz="4"/>
@@ -3095,7 +2483,7 @@
         </w:tc>
         <w:tc>
           <w:tcPr>
-            <w:tcW w:type="dxa" w:w="1784"/>
+            <w:tcW w:type="dxa" w:w="1965"/>
             <w:tcBorders>
               <w:top w:val="single" w:color="999999" w:sz="4"/>
               <w:left w:val="single" w:color="999999" w:sz="4"/>
@@ -3130,37 +2518,7 @@
         </w:trPr>
         <w:tc>
           <w:tcPr>
-            <w:tcW w:type="dxa" w:w="1632"/>
-            <w:tcBorders>
-              <w:top w:val="single" w:color="999999" w:sz="4"/>
-              <w:left w:val="single" w:color="999999" w:sz="4"/>
-              <w:bottom w:val="single" w:color="999999" w:sz="4"/>
-              <w:right w:val="single" w:color="999999" w:sz="4"/>
-            </w:tcBorders>
-            <w:shd w:fill="FFFFFF" w:color="auto" w:val="clear"/>
-            <w:tcMar>
-              <w:top w:type="dxa" w:w="60"/>
-              <w:left w:type="dxa" w:w="100"/>
-              <w:bottom w:type="dxa" w:w="60"/>
-              <w:right w:type="dxa" w:w="100"/>
-            </w:tcMar>
-          </w:tcPr>
-          <w:p>
-            <w:r>
-              <w:rPr>
-                <w:b w:val="false"/>
-                <w:bCs w:val="false"/>
-                <w:color w:val="000000"/>
-                <w:sz w:val="19"/>
-                <w:szCs w:val="19"/>
-              </w:rPr>
-              <w:t xml:space="preserve">Pendiente</w:t>
-            </w:r>
-          </w:p>
-        </w:tc>
-        <w:tc>
-          <w:tcPr>
-            <w:tcW w:type="dxa" w:w="1484"/>
+            <w:tcW w:type="dxa" w:w="1963"/>
             <w:tcBorders>
               <w:top w:val="single" w:color="999999" w:sz="4"/>
               <w:left w:val="single" w:color="999999" w:sz="4"/>
@@ -3190,7 +2548,7 @@
         </w:tc>
         <w:tc>
           <w:tcPr>
-            <w:tcW w:type="dxa" w:w="6235"/>
+            <w:tcW w:type="dxa" w:w="6872"/>
             <w:tcBorders>
               <w:top w:val="single" w:color="999999" w:sz="4"/>
               <w:left w:val="single" w:color="999999" w:sz="4"/>
@@ -3220,7 +2578,7 @@
         </w:tc>
         <w:tc>
           <w:tcPr>
-            <w:tcW w:type="dxa" w:w="3265"/>
+            <w:tcW w:type="dxa" w:w="3600"/>
             <w:tcBorders>
               <w:top w:val="single" w:color="999999" w:sz="4"/>
               <w:left w:val="single" w:color="999999" w:sz="4"/>
@@ -3250,7 +2608,7 @@
         </w:tc>
         <w:tc>
           <w:tcPr>
-            <w:tcW w:type="dxa" w:w="1784"/>
+            <w:tcW w:type="dxa" w:w="1965"/>
             <w:tcBorders>
               <w:top w:val="single" w:color="999999" w:sz="4"/>
               <w:left w:val="single" w:color="999999" w:sz="4"/>
@@ -3285,37 +2643,7 @@
         </w:trPr>
         <w:tc>
           <w:tcPr>
-            <w:tcW w:type="dxa" w:w="1632"/>
-            <w:tcBorders>
-              <w:top w:val="single" w:color="999999" w:sz="4"/>
-              <w:left w:val="single" w:color="999999" w:sz="4"/>
-              <w:bottom w:val="single" w:color="999999" w:sz="4"/>
-              <w:right w:val="single" w:color="999999" w:sz="4"/>
-            </w:tcBorders>
-            <w:shd w:fill="FFFFFF" w:color="auto" w:val="clear"/>
-            <w:tcMar>
-              <w:top w:type="dxa" w:w="60"/>
-              <w:left w:type="dxa" w:w="100"/>
-              <w:bottom w:type="dxa" w:w="60"/>
-              <w:right w:type="dxa" w:w="100"/>
-            </w:tcMar>
-          </w:tcPr>
-          <w:p>
-            <w:r>
-              <w:rPr>
-                <w:b w:val="false"/>
-                <w:bCs w:val="false"/>
-                <w:color w:val="000000"/>
-                <w:sz w:val="19"/>
-                <w:szCs w:val="19"/>
-              </w:rPr>
-              <w:t xml:space="preserve">Pendiente</w:t>
-            </w:r>
-          </w:p>
-        </w:tc>
-        <w:tc>
-          <w:tcPr>
-            <w:tcW w:type="dxa" w:w="1484"/>
+            <w:tcW w:type="dxa" w:w="1963"/>
             <w:tcBorders>
               <w:top w:val="single" w:color="999999" w:sz="4"/>
               <w:left w:val="single" w:color="999999" w:sz="4"/>
@@ -3345,7 +2673,7 @@
         </w:tc>
         <w:tc>
           <w:tcPr>
-            <w:tcW w:type="dxa" w:w="6235"/>
+            <w:tcW w:type="dxa" w:w="6872"/>
             <w:tcBorders>
               <w:top w:val="single" w:color="999999" w:sz="4"/>
               <w:left w:val="single" w:color="999999" w:sz="4"/>
@@ -3375,7 +2703,7 @@
         </w:tc>
         <w:tc>
           <w:tcPr>
-            <w:tcW w:type="dxa" w:w="3265"/>
+            <w:tcW w:type="dxa" w:w="3600"/>
             <w:tcBorders>
               <w:top w:val="single" w:color="999999" w:sz="4"/>
               <w:left w:val="single" w:color="999999" w:sz="4"/>
@@ -3405,7 +2733,7 @@
         </w:tc>
         <w:tc>
           <w:tcPr>
-            <w:tcW w:type="dxa" w:w="1784"/>
+            <w:tcW w:type="dxa" w:w="1965"/>
             <w:tcBorders>
               <w:top w:val="single" w:color="999999" w:sz="4"/>
               <w:left w:val="single" w:color="999999" w:sz="4"/>
@@ -3440,37 +2768,7 @@
         </w:trPr>
         <w:tc>
           <w:tcPr>
-            <w:tcW w:type="dxa" w:w="1632"/>
-            <w:tcBorders>
-              <w:top w:val="single" w:color="999999" w:sz="4"/>
-              <w:left w:val="single" w:color="999999" w:sz="4"/>
-              <w:bottom w:val="single" w:color="999999" w:sz="4"/>
-              <w:right w:val="single" w:color="999999" w:sz="4"/>
-            </w:tcBorders>
-            <w:shd w:fill="FFFFFF" w:color="auto" w:val="clear"/>
-            <w:tcMar>
-              <w:top w:type="dxa" w:w="60"/>
-              <w:left w:type="dxa" w:w="100"/>
-              <w:bottom w:type="dxa" w:w="60"/>
-              <w:right w:type="dxa" w:w="100"/>
-            </w:tcMar>
-          </w:tcPr>
-          <w:p>
-            <w:r>
-              <w:rPr>
-                <w:b w:val="false"/>
-                <w:bCs w:val="false"/>
-                <w:color w:val="000000"/>
-                <w:sz w:val="19"/>
-                <w:szCs w:val="19"/>
-              </w:rPr>
-              <w:t xml:space="preserve">Pendiente</w:t>
-            </w:r>
-          </w:p>
-        </w:tc>
-        <w:tc>
-          <w:tcPr>
-            <w:tcW w:type="dxa" w:w="1484"/>
+            <w:tcW w:type="dxa" w:w="1963"/>
             <w:tcBorders>
               <w:top w:val="single" w:color="999999" w:sz="4"/>
               <w:left w:val="single" w:color="999999" w:sz="4"/>
@@ -3500,7 +2798,7 @@
         </w:tc>
         <w:tc>
           <w:tcPr>
-            <w:tcW w:type="dxa" w:w="6235"/>
+            <w:tcW w:type="dxa" w:w="6872"/>
             <w:tcBorders>
               <w:top w:val="single" w:color="999999" w:sz="4"/>
               <w:left w:val="single" w:color="999999" w:sz="4"/>
@@ -3530,7 +2828,7 @@
         </w:tc>
         <w:tc>
           <w:tcPr>
-            <w:tcW w:type="dxa" w:w="3265"/>
+            <w:tcW w:type="dxa" w:w="3600"/>
             <w:tcBorders>
               <w:top w:val="single" w:color="999999" w:sz="4"/>
               <w:left w:val="single" w:color="999999" w:sz="4"/>
@@ -3560,7 +2858,7 @@
         </w:tc>
         <w:tc>
           <w:tcPr>
-            <w:tcW w:type="dxa" w:w="1784"/>
+            <w:tcW w:type="dxa" w:w="1965"/>
             <w:tcBorders>
               <w:top w:val="single" w:color="999999" w:sz="4"/>
               <w:left w:val="single" w:color="999999" w:sz="4"/>
@@ -3595,37 +2893,7 @@
         </w:trPr>
         <w:tc>
           <w:tcPr>
-            <w:tcW w:type="dxa" w:w="1632"/>
-            <w:tcBorders>
-              <w:top w:val="single" w:color="999999" w:sz="4"/>
-              <w:left w:val="single" w:color="999999" w:sz="4"/>
-              <w:bottom w:val="single" w:color="999999" w:sz="4"/>
-              <w:right w:val="single" w:color="999999" w:sz="4"/>
-            </w:tcBorders>
-            <w:shd w:fill="FFFFFF" w:color="auto" w:val="clear"/>
-            <w:tcMar>
-              <w:top w:type="dxa" w:w="60"/>
-              <w:left w:type="dxa" w:w="100"/>
-              <w:bottom w:type="dxa" w:w="60"/>
-              <w:right w:type="dxa" w:w="100"/>
-            </w:tcMar>
-          </w:tcPr>
-          <w:p>
-            <w:r>
-              <w:rPr>
-                <w:b w:val="false"/>
-                <w:bCs w:val="false"/>
-                <w:color w:val="000000"/>
-                <w:sz w:val="19"/>
-                <w:szCs w:val="19"/>
-              </w:rPr>
-              <w:t xml:space="preserve">Pendiente</w:t>
-            </w:r>
-          </w:p>
-        </w:tc>
-        <w:tc>
-          <w:tcPr>
-            <w:tcW w:type="dxa" w:w="1484"/>
+            <w:tcW w:type="dxa" w:w="1963"/>
             <w:tcBorders>
               <w:top w:val="single" w:color="999999" w:sz="4"/>
               <w:left w:val="single" w:color="999999" w:sz="4"/>
@@ -3655,7 +2923,7 @@
         </w:tc>
         <w:tc>
           <w:tcPr>
-            <w:tcW w:type="dxa" w:w="6235"/>
+            <w:tcW w:type="dxa" w:w="6872"/>
             <w:tcBorders>
               <w:top w:val="single" w:color="999999" w:sz="4"/>
               <w:left w:val="single" w:color="999999" w:sz="4"/>
@@ -3685,7 +2953,7 @@
         </w:tc>
         <w:tc>
           <w:tcPr>
-            <w:tcW w:type="dxa" w:w="3265"/>
+            <w:tcW w:type="dxa" w:w="3600"/>
             <w:tcBorders>
               <w:top w:val="single" w:color="999999" w:sz="4"/>
               <w:left w:val="single" w:color="999999" w:sz="4"/>
@@ -3715,7 +2983,7 @@
         </w:tc>
         <w:tc>
           <w:tcPr>
-            <w:tcW w:type="dxa" w:w="1784"/>
+            <w:tcW w:type="dxa" w:w="1965"/>
             <w:tcBorders>
               <w:top w:val="single" w:color="999999" w:sz="4"/>
               <w:left w:val="single" w:color="999999" w:sz="4"/>
@@ -3750,37 +3018,7 @@
         </w:trPr>
         <w:tc>
           <w:tcPr>
-            <w:tcW w:type="dxa" w:w="1632"/>
-            <w:tcBorders>
-              <w:top w:val="single" w:color="999999" w:sz="4"/>
-              <w:left w:val="single" w:color="999999" w:sz="4"/>
-              <w:bottom w:val="single" w:color="999999" w:sz="4"/>
-              <w:right w:val="single" w:color="999999" w:sz="4"/>
-            </w:tcBorders>
-            <w:shd w:fill="FFFFFF" w:color="auto" w:val="clear"/>
-            <w:tcMar>
-              <w:top w:type="dxa" w:w="60"/>
-              <w:left w:type="dxa" w:w="100"/>
-              <w:bottom w:type="dxa" w:w="60"/>
-              <w:right w:type="dxa" w:w="100"/>
-            </w:tcMar>
-          </w:tcPr>
-          <w:p>
-            <w:r>
-              <w:rPr>
-                <w:b w:val="false"/>
-                <w:bCs w:val="false"/>
-                <w:color w:val="000000"/>
-                <w:sz w:val="19"/>
-                <w:szCs w:val="19"/>
-              </w:rPr>
-              <w:t xml:space="preserve">Pendiente</w:t>
-            </w:r>
-          </w:p>
-        </w:tc>
-        <w:tc>
-          <w:tcPr>
-            <w:tcW w:type="dxa" w:w="1484"/>
+            <w:tcW w:type="dxa" w:w="1963"/>
             <w:tcBorders>
               <w:top w:val="single" w:color="999999" w:sz="4"/>
               <w:left w:val="single" w:color="999999" w:sz="4"/>
@@ -3810,7 +3048,7 @@
         </w:tc>
         <w:tc>
           <w:tcPr>
-            <w:tcW w:type="dxa" w:w="6235"/>
+            <w:tcW w:type="dxa" w:w="6872"/>
             <w:tcBorders>
               <w:top w:val="single" w:color="999999" w:sz="4"/>
               <w:left w:val="single" w:color="999999" w:sz="4"/>
@@ -3840,7 +3078,7 @@
         </w:tc>
         <w:tc>
           <w:tcPr>
-            <w:tcW w:type="dxa" w:w="3265"/>
+            <w:tcW w:type="dxa" w:w="3600"/>
             <w:tcBorders>
               <w:top w:val="single" w:color="999999" w:sz="4"/>
               <w:left w:val="single" w:color="999999" w:sz="4"/>
@@ -3870,7 +3108,7 @@
         </w:tc>
         <w:tc>
           <w:tcPr>
-            <w:tcW w:type="dxa" w:w="1784"/>
+            <w:tcW w:type="dxa" w:w="1965"/>
             <w:tcBorders>
               <w:top w:val="single" w:color="999999" w:sz="4"/>
               <w:left w:val="single" w:color="999999" w:sz="4"/>
@@ -3922,11 +3160,10 @@
         </w:tblBorders>
       </w:tblPr>
       <w:tblGrid>
-        <w:gridCol w:w="1632"/>
-        <w:gridCol w:w="1484"/>
-        <w:gridCol w:w="6235"/>
-        <w:gridCol w:w="3265"/>
-        <w:gridCol w:w="1784"/>
+        <w:gridCol w:w="1963"/>
+        <w:gridCol w:w="6872"/>
+        <w:gridCol w:w="3600"/>
+        <w:gridCol w:w="1965"/>
       </w:tblGrid>
       <w:tr>
         <w:trPr>
@@ -3934,7 +3171,7 @@
         </w:trPr>
         <w:tc>
           <w:tcPr>
-            <w:tcW w:type="dxa" w:w="1632"/>
+            <w:tcW w:type="dxa" w:w="1963"/>
             <w:tcBorders>
               <w:top w:val="single" w:color="999999" w:sz="4"/>
               <w:left w:val="single" w:color="999999" w:sz="4"/>
@@ -3958,13 +3195,13 @@
                 <w:sz w:val="19"/>
                 <w:szCs w:val="19"/>
               </w:rPr>
-              <w:t xml:space="preserve">Estado</w:t>
-            </w:r>
-          </w:p>
-        </w:tc>
-        <w:tc>
-          <w:tcPr>
-            <w:tcW w:type="dxa" w:w="1484"/>
+              <w:t xml:space="preserve">ID</w:t>
+            </w:r>
+          </w:p>
+        </w:tc>
+        <w:tc>
+          <w:tcPr>
+            <w:tcW w:type="dxa" w:w="6872"/>
             <w:tcBorders>
               <w:top w:val="single" w:color="999999" w:sz="4"/>
               <w:left w:val="single" w:color="999999" w:sz="4"/>
@@ -3988,13 +3225,13 @@
                 <w:sz w:val="19"/>
                 <w:szCs w:val="19"/>
               </w:rPr>
-              <w:t xml:space="preserve">ID</w:t>
-            </w:r>
-          </w:p>
-        </w:tc>
-        <w:tc>
-          <w:tcPr>
-            <w:tcW w:type="dxa" w:w="6235"/>
+              <w:t xml:space="preserve">Funcionalidad</w:t>
+            </w:r>
+          </w:p>
+        </w:tc>
+        <w:tc>
+          <w:tcPr>
+            <w:tcW w:type="dxa" w:w="3600"/>
             <w:tcBorders>
               <w:top w:val="single" w:color="999999" w:sz="4"/>
               <w:left w:val="single" w:color="999999" w:sz="4"/>
@@ -4018,43 +3255,13 @@
                 <w:sz w:val="19"/>
                 <w:szCs w:val="19"/>
               </w:rPr>
-              <w:t xml:space="preserve">Funcionalidad</w:t>
-            </w:r>
-          </w:p>
-        </w:tc>
-        <w:tc>
-          <w:tcPr>
-            <w:tcW w:type="dxa" w:w="3265"/>
-            <w:tcBorders>
-              <w:top w:val="single" w:color="999999" w:sz="4"/>
-              <w:left w:val="single" w:color="999999" w:sz="4"/>
-              <w:bottom w:val="single" w:color="999999" w:sz="4"/>
-              <w:right w:val="single" w:color="999999" w:sz="4"/>
-            </w:tcBorders>
-            <w:shd w:fill="1B5E3A" w:color="auto" w:val="clear"/>
-            <w:tcMar>
-              <w:top w:type="dxa" w:w="60"/>
-              <w:left w:type="dxa" w:w="100"/>
-              <w:bottom w:type="dxa" w:w="60"/>
-              <w:right w:type="dxa" w:w="100"/>
-            </w:tcMar>
-          </w:tcPr>
-          <w:p>
-            <w:r>
-              <w:rPr>
-                <w:b/>
-                <w:bCs/>
-                <w:color w:val="FFFFFF"/>
-                <w:sz w:val="19"/>
-                <w:szCs w:val="19"/>
-              </w:rPr>
               <w:t xml:space="preserve">Actor</w:t>
             </w:r>
           </w:p>
         </w:tc>
         <w:tc>
           <w:tcPr>
-            <w:tcW w:type="dxa" w:w="1784"/>
+            <w:tcW w:type="dxa" w:w="1965"/>
             <w:tcBorders>
               <w:top w:val="single" w:color="999999" w:sz="4"/>
               <w:left w:val="single" w:color="999999" w:sz="4"/>
@@ -4089,37 +3296,7 @@
         </w:trPr>
         <w:tc>
           <w:tcPr>
-            <w:tcW w:type="dxa" w:w="1632"/>
-            <w:tcBorders>
-              <w:top w:val="single" w:color="999999" w:sz="4"/>
-              <w:left w:val="single" w:color="999999" w:sz="4"/>
-              <w:bottom w:val="single" w:color="999999" w:sz="4"/>
-              <w:right w:val="single" w:color="999999" w:sz="4"/>
-            </w:tcBorders>
-            <w:shd w:fill="FFFFFF" w:color="auto" w:val="clear"/>
-            <w:tcMar>
-              <w:top w:type="dxa" w:w="60"/>
-              <w:left w:type="dxa" w:w="100"/>
-              <w:bottom w:type="dxa" w:w="60"/>
-              <w:right w:type="dxa" w:w="100"/>
-            </w:tcMar>
-          </w:tcPr>
-          <w:p>
-            <w:r>
-              <w:rPr>
-                <w:b w:val="false"/>
-                <w:bCs w:val="false"/>
-                <w:color w:val="000000"/>
-                <w:sz w:val="19"/>
-                <w:szCs w:val="19"/>
-              </w:rPr>
-              <w:t xml:space="preserve">Pendiente</w:t>
-            </w:r>
-          </w:p>
-        </w:tc>
-        <w:tc>
-          <w:tcPr>
-            <w:tcW w:type="dxa" w:w="1484"/>
+            <w:tcW w:type="dxa" w:w="1963"/>
             <w:tcBorders>
               <w:top w:val="single" w:color="999999" w:sz="4"/>
               <w:left w:val="single" w:color="999999" w:sz="4"/>
@@ -4149,7 +3326,7 @@
         </w:tc>
         <w:tc>
           <w:tcPr>
-            <w:tcW w:type="dxa" w:w="6235"/>
+            <w:tcW w:type="dxa" w:w="6872"/>
             <w:tcBorders>
               <w:top w:val="single" w:color="999999" w:sz="4"/>
               <w:left w:val="single" w:color="999999" w:sz="4"/>
@@ -4179,7 +3356,7 @@
         </w:tc>
         <w:tc>
           <w:tcPr>
-            <w:tcW w:type="dxa" w:w="3265"/>
+            <w:tcW w:type="dxa" w:w="3600"/>
             <w:tcBorders>
               <w:top w:val="single" w:color="999999" w:sz="4"/>
               <w:left w:val="single" w:color="999999" w:sz="4"/>
@@ -4209,7 +3386,7 @@
         </w:tc>
         <w:tc>
           <w:tcPr>
-            <w:tcW w:type="dxa" w:w="1784"/>
+            <w:tcW w:type="dxa" w:w="1965"/>
             <w:tcBorders>
               <w:top w:val="single" w:color="999999" w:sz="4"/>
               <w:left w:val="single" w:color="999999" w:sz="4"/>
@@ -4244,37 +3421,7 @@
         </w:trPr>
         <w:tc>
           <w:tcPr>
-            <w:tcW w:type="dxa" w:w="1632"/>
-            <w:tcBorders>
-              <w:top w:val="single" w:color="999999" w:sz="4"/>
-              <w:left w:val="single" w:color="999999" w:sz="4"/>
-              <w:bottom w:val="single" w:color="999999" w:sz="4"/>
-              <w:right w:val="single" w:color="999999" w:sz="4"/>
-            </w:tcBorders>
-            <w:shd w:fill="FFFFFF" w:color="auto" w:val="clear"/>
-            <w:tcMar>
-              <w:top w:type="dxa" w:w="60"/>
-              <w:left w:type="dxa" w:w="100"/>
-              <w:bottom w:type="dxa" w:w="60"/>
-              <w:right w:type="dxa" w:w="100"/>
-            </w:tcMar>
-          </w:tcPr>
-          <w:p>
-            <w:r>
-              <w:rPr>
-                <w:b w:val="false"/>
-                <w:bCs w:val="false"/>
-                <w:color w:val="000000"/>
-                <w:sz w:val="19"/>
-                <w:szCs w:val="19"/>
-              </w:rPr>
-              <w:t xml:space="preserve">Pendiente</w:t>
-            </w:r>
-          </w:p>
-        </w:tc>
-        <w:tc>
-          <w:tcPr>
-            <w:tcW w:type="dxa" w:w="1484"/>
+            <w:tcW w:type="dxa" w:w="1963"/>
             <w:tcBorders>
               <w:top w:val="single" w:color="999999" w:sz="4"/>
               <w:left w:val="single" w:color="999999" w:sz="4"/>
@@ -4304,7 +3451,7 @@
         </w:tc>
         <w:tc>
           <w:tcPr>
-            <w:tcW w:type="dxa" w:w="6235"/>
+            <w:tcW w:type="dxa" w:w="6872"/>
             <w:tcBorders>
               <w:top w:val="single" w:color="999999" w:sz="4"/>
               <w:left w:val="single" w:color="999999" w:sz="4"/>
@@ -4334,7 +3481,7 @@
         </w:tc>
         <w:tc>
           <w:tcPr>
-            <w:tcW w:type="dxa" w:w="3265"/>
+            <w:tcW w:type="dxa" w:w="3600"/>
             <w:tcBorders>
               <w:top w:val="single" w:color="999999" w:sz="4"/>
               <w:left w:val="single" w:color="999999" w:sz="4"/>
@@ -4364,7 +3511,7 @@
         </w:tc>
         <w:tc>
           <w:tcPr>
-            <w:tcW w:type="dxa" w:w="1784"/>
+            <w:tcW w:type="dxa" w:w="1965"/>
             <w:tcBorders>
               <w:top w:val="single" w:color="999999" w:sz="4"/>
               <w:left w:val="single" w:color="999999" w:sz="4"/>
@@ -4399,37 +3546,7 @@
         </w:trPr>
         <w:tc>
           <w:tcPr>
-            <w:tcW w:type="dxa" w:w="1632"/>
-            <w:tcBorders>
-              <w:top w:val="single" w:color="999999" w:sz="4"/>
-              <w:left w:val="single" w:color="999999" w:sz="4"/>
-              <w:bottom w:val="single" w:color="999999" w:sz="4"/>
-              <w:right w:val="single" w:color="999999" w:sz="4"/>
-            </w:tcBorders>
-            <w:shd w:fill="FFFFFF" w:color="auto" w:val="clear"/>
-            <w:tcMar>
-              <w:top w:type="dxa" w:w="60"/>
-              <w:left w:type="dxa" w:w="100"/>
-              <w:bottom w:type="dxa" w:w="60"/>
-              <w:right w:type="dxa" w:w="100"/>
-            </w:tcMar>
-          </w:tcPr>
-          <w:p>
-            <w:r>
-              <w:rPr>
-                <w:b w:val="false"/>
-                <w:bCs w:val="false"/>
-                <w:color w:val="000000"/>
-                <w:sz w:val="19"/>
-                <w:szCs w:val="19"/>
-              </w:rPr>
-              <w:t xml:space="preserve">Pendiente</w:t>
-            </w:r>
-          </w:p>
-        </w:tc>
-        <w:tc>
-          <w:tcPr>
-            <w:tcW w:type="dxa" w:w="1484"/>
+            <w:tcW w:type="dxa" w:w="1963"/>
             <w:tcBorders>
               <w:top w:val="single" w:color="999999" w:sz="4"/>
               <w:left w:val="single" w:color="999999" w:sz="4"/>
@@ -4459,7 +3576,7 @@
         </w:tc>
         <w:tc>
           <w:tcPr>
-            <w:tcW w:type="dxa" w:w="6235"/>
+            <w:tcW w:type="dxa" w:w="6872"/>
             <w:tcBorders>
               <w:top w:val="single" w:color="999999" w:sz="4"/>
               <w:left w:val="single" w:color="999999" w:sz="4"/>
@@ -4489,7 +3606,7 @@
         </w:tc>
         <w:tc>
           <w:tcPr>
-            <w:tcW w:type="dxa" w:w="3265"/>
+            <w:tcW w:type="dxa" w:w="3600"/>
             <w:tcBorders>
               <w:top w:val="single" w:color="999999" w:sz="4"/>
               <w:left w:val="single" w:color="999999" w:sz="4"/>
@@ -4519,7 +3636,7 @@
         </w:tc>
         <w:tc>
           <w:tcPr>
-            <w:tcW w:type="dxa" w:w="1784"/>
+            <w:tcW w:type="dxa" w:w="1965"/>
             <w:tcBorders>
               <w:top w:val="single" w:color="999999" w:sz="4"/>
               <w:left w:val="single" w:color="999999" w:sz="4"/>
@@ -4571,11 +3688,10 @@
         </w:tblBorders>
       </w:tblPr>
       <w:tblGrid>
-        <w:gridCol w:w="1632"/>
-        <w:gridCol w:w="1484"/>
-        <w:gridCol w:w="6235"/>
-        <w:gridCol w:w="3265"/>
-        <w:gridCol w:w="1784"/>
+        <w:gridCol w:w="1963"/>
+        <w:gridCol w:w="6872"/>
+        <w:gridCol w:w="3600"/>
+        <w:gridCol w:w="1965"/>
       </w:tblGrid>
       <w:tr>
         <w:trPr>
@@ -4583,7 +3699,7 @@
         </w:trPr>
         <w:tc>
           <w:tcPr>
-            <w:tcW w:type="dxa" w:w="1632"/>
+            <w:tcW w:type="dxa" w:w="1963"/>
             <w:tcBorders>
               <w:top w:val="single" w:color="999999" w:sz="4"/>
               <w:left w:val="single" w:color="999999" w:sz="4"/>
@@ -4607,13 +3723,13 @@
                 <w:sz w:val="19"/>
                 <w:szCs w:val="19"/>
               </w:rPr>
-              <w:t xml:space="preserve">Estado</w:t>
-            </w:r>
-          </w:p>
-        </w:tc>
-        <w:tc>
-          <w:tcPr>
-            <w:tcW w:type="dxa" w:w="1484"/>
+              <w:t xml:space="preserve">ID</w:t>
+            </w:r>
+          </w:p>
+        </w:tc>
+        <w:tc>
+          <w:tcPr>
+            <w:tcW w:type="dxa" w:w="6872"/>
             <w:tcBorders>
               <w:top w:val="single" w:color="999999" w:sz="4"/>
               <w:left w:val="single" w:color="999999" w:sz="4"/>
@@ -4637,13 +3753,13 @@
                 <w:sz w:val="19"/>
                 <w:szCs w:val="19"/>
               </w:rPr>
-              <w:t xml:space="preserve">ID</w:t>
-            </w:r>
-          </w:p>
-        </w:tc>
-        <w:tc>
-          <w:tcPr>
-            <w:tcW w:type="dxa" w:w="6235"/>
+              <w:t xml:space="preserve">Funcionalidad</w:t>
+            </w:r>
+          </w:p>
+        </w:tc>
+        <w:tc>
+          <w:tcPr>
+            <w:tcW w:type="dxa" w:w="3600"/>
             <w:tcBorders>
               <w:top w:val="single" w:color="999999" w:sz="4"/>
               <w:left w:val="single" w:color="999999" w:sz="4"/>
@@ -4667,43 +3783,13 @@
                 <w:sz w:val="19"/>
                 <w:szCs w:val="19"/>
               </w:rPr>
-              <w:t xml:space="preserve">Funcionalidad</w:t>
-            </w:r>
-          </w:p>
-        </w:tc>
-        <w:tc>
-          <w:tcPr>
-            <w:tcW w:type="dxa" w:w="3265"/>
-            <w:tcBorders>
-              <w:top w:val="single" w:color="999999" w:sz="4"/>
-              <w:left w:val="single" w:color="999999" w:sz="4"/>
-              <w:bottom w:val="single" w:color="999999" w:sz="4"/>
-              <w:right w:val="single" w:color="999999" w:sz="4"/>
-            </w:tcBorders>
-            <w:shd w:fill="1B5E3A" w:color="auto" w:val="clear"/>
-            <w:tcMar>
-              <w:top w:type="dxa" w:w="60"/>
-              <w:left w:type="dxa" w:w="100"/>
-              <w:bottom w:type="dxa" w:w="60"/>
-              <w:right w:type="dxa" w:w="100"/>
-            </w:tcMar>
-          </w:tcPr>
-          <w:p>
-            <w:r>
-              <w:rPr>
-                <w:b/>
-                <w:bCs/>
-                <w:color w:val="FFFFFF"/>
-                <w:sz w:val="19"/>
-                <w:szCs w:val="19"/>
-              </w:rPr>
               <w:t xml:space="preserve">Actor</w:t>
             </w:r>
           </w:p>
         </w:tc>
         <w:tc>
           <w:tcPr>
-            <w:tcW w:type="dxa" w:w="1784"/>
+            <w:tcW w:type="dxa" w:w="1965"/>
             <w:tcBorders>
               <w:top w:val="single" w:color="999999" w:sz="4"/>
               <w:left w:val="single" w:color="999999" w:sz="4"/>
@@ -4738,37 +3824,7 @@
         </w:trPr>
         <w:tc>
           <w:tcPr>
-            <w:tcW w:type="dxa" w:w="1632"/>
-            <w:tcBorders>
-              <w:top w:val="single" w:color="999999" w:sz="4"/>
-              <w:left w:val="single" w:color="999999" w:sz="4"/>
-              <w:bottom w:val="single" w:color="999999" w:sz="4"/>
-              <w:right w:val="single" w:color="999999" w:sz="4"/>
-            </w:tcBorders>
-            <w:shd w:fill="FFFFFF" w:color="auto" w:val="clear"/>
-            <w:tcMar>
-              <w:top w:type="dxa" w:w="60"/>
-              <w:left w:type="dxa" w:w="100"/>
-              <w:bottom w:type="dxa" w:w="60"/>
-              <w:right w:type="dxa" w:w="100"/>
-            </w:tcMar>
-          </w:tcPr>
-          <w:p>
-            <w:r>
-              <w:rPr>
-                <w:b w:val="false"/>
-                <w:bCs w:val="false"/>
-                <w:color w:val="000000"/>
-                <w:sz w:val="19"/>
-                <w:szCs w:val="19"/>
-              </w:rPr>
-              <w:t xml:space="preserve">Pendiente</w:t>
-            </w:r>
-          </w:p>
-        </w:tc>
-        <w:tc>
-          <w:tcPr>
-            <w:tcW w:type="dxa" w:w="1484"/>
+            <w:tcW w:type="dxa" w:w="1963"/>
             <w:tcBorders>
               <w:top w:val="single" w:color="999999" w:sz="4"/>
               <w:left w:val="single" w:color="999999" w:sz="4"/>
@@ -4798,7 +3854,7 @@
         </w:tc>
         <w:tc>
           <w:tcPr>
-            <w:tcW w:type="dxa" w:w="6235"/>
+            <w:tcW w:type="dxa" w:w="6872"/>
             <w:tcBorders>
               <w:top w:val="single" w:color="999999" w:sz="4"/>
               <w:left w:val="single" w:color="999999" w:sz="4"/>
@@ -4828,7 +3884,7 @@
         </w:tc>
         <w:tc>
           <w:tcPr>
-            <w:tcW w:type="dxa" w:w="3265"/>
+            <w:tcW w:type="dxa" w:w="3600"/>
             <w:tcBorders>
               <w:top w:val="single" w:color="999999" w:sz="4"/>
               <w:left w:val="single" w:color="999999" w:sz="4"/>
@@ -4858,7 +3914,7 @@
         </w:tc>
         <w:tc>
           <w:tcPr>
-            <w:tcW w:type="dxa" w:w="1784"/>
+            <w:tcW w:type="dxa" w:w="1965"/>
             <w:tcBorders>
               <w:top w:val="single" w:color="999999" w:sz="4"/>
               <w:left w:val="single" w:color="999999" w:sz="4"/>
@@ -4893,37 +3949,7 @@
         </w:trPr>
         <w:tc>
           <w:tcPr>
-            <w:tcW w:type="dxa" w:w="1632"/>
-            <w:tcBorders>
-              <w:top w:val="single" w:color="999999" w:sz="4"/>
-              <w:left w:val="single" w:color="999999" w:sz="4"/>
-              <w:bottom w:val="single" w:color="999999" w:sz="4"/>
-              <w:right w:val="single" w:color="999999" w:sz="4"/>
-            </w:tcBorders>
-            <w:shd w:fill="FFFFFF" w:color="auto" w:val="clear"/>
-            <w:tcMar>
-              <w:top w:type="dxa" w:w="60"/>
-              <w:left w:type="dxa" w:w="100"/>
-              <w:bottom w:type="dxa" w:w="60"/>
-              <w:right w:type="dxa" w:w="100"/>
-            </w:tcMar>
-          </w:tcPr>
-          <w:p>
-            <w:r>
-              <w:rPr>
-                <w:b w:val="false"/>
-                <w:bCs w:val="false"/>
-                <w:color w:val="000000"/>
-                <w:sz w:val="19"/>
-                <w:szCs w:val="19"/>
-              </w:rPr>
-              <w:t xml:space="preserve">Pendiente</w:t>
-            </w:r>
-          </w:p>
-        </w:tc>
-        <w:tc>
-          <w:tcPr>
-            <w:tcW w:type="dxa" w:w="1484"/>
+            <w:tcW w:type="dxa" w:w="1963"/>
             <w:tcBorders>
               <w:top w:val="single" w:color="999999" w:sz="4"/>
               <w:left w:val="single" w:color="999999" w:sz="4"/>
@@ -4953,7 +3979,7 @@
         </w:tc>
         <w:tc>
           <w:tcPr>
-            <w:tcW w:type="dxa" w:w="6235"/>
+            <w:tcW w:type="dxa" w:w="6872"/>
             <w:tcBorders>
               <w:top w:val="single" w:color="999999" w:sz="4"/>
               <w:left w:val="single" w:color="999999" w:sz="4"/>
@@ -4983,7 +4009,7 @@
         </w:tc>
         <w:tc>
           <w:tcPr>
-            <w:tcW w:type="dxa" w:w="3265"/>
+            <w:tcW w:type="dxa" w:w="3600"/>
             <w:tcBorders>
               <w:top w:val="single" w:color="999999" w:sz="4"/>
               <w:left w:val="single" w:color="999999" w:sz="4"/>
@@ -5013,7 +4039,7 @@
         </w:tc>
         <w:tc>
           <w:tcPr>
-            <w:tcW w:type="dxa" w:w="1784"/>
+            <w:tcW w:type="dxa" w:w="1965"/>
             <w:tcBorders>
               <w:top w:val="single" w:color="999999" w:sz="4"/>
               <w:left w:val="single" w:color="999999" w:sz="4"/>
@@ -5048,37 +4074,7 @@
         </w:trPr>
         <w:tc>
           <w:tcPr>
-            <w:tcW w:type="dxa" w:w="1632"/>
-            <w:tcBorders>
-              <w:top w:val="single" w:color="999999" w:sz="4"/>
-              <w:left w:val="single" w:color="999999" w:sz="4"/>
-              <w:bottom w:val="single" w:color="999999" w:sz="4"/>
-              <w:right w:val="single" w:color="999999" w:sz="4"/>
-            </w:tcBorders>
-            <w:shd w:fill="FFFFFF" w:color="auto" w:val="clear"/>
-            <w:tcMar>
-              <w:top w:type="dxa" w:w="60"/>
-              <w:left w:type="dxa" w:w="100"/>
-              <w:bottom w:type="dxa" w:w="60"/>
-              <w:right w:type="dxa" w:w="100"/>
-            </w:tcMar>
-          </w:tcPr>
-          <w:p>
-            <w:r>
-              <w:rPr>
-                <w:b w:val="false"/>
-                <w:bCs w:val="false"/>
-                <w:color w:val="000000"/>
-                <w:sz w:val="19"/>
-                <w:szCs w:val="19"/>
-              </w:rPr>
-              <w:t xml:space="preserve">Pendiente</w:t>
-            </w:r>
-          </w:p>
-        </w:tc>
-        <w:tc>
-          <w:tcPr>
-            <w:tcW w:type="dxa" w:w="1484"/>
+            <w:tcW w:type="dxa" w:w="1963"/>
             <w:tcBorders>
               <w:top w:val="single" w:color="999999" w:sz="4"/>
               <w:left w:val="single" w:color="999999" w:sz="4"/>
@@ -5108,7 +4104,7 @@
         </w:tc>
         <w:tc>
           <w:tcPr>
-            <w:tcW w:type="dxa" w:w="6235"/>
+            <w:tcW w:type="dxa" w:w="6872"/>
             <w:tcBorders>
               <w:top w:val="single" w:color="999999" w:sz="4"/>
               <w:left w:val="single" w:color="999999" w:sz="4"/>
@@ -5138,7 +4134,7 @@
         </w:tc>
         <w:tc>
           <w:tcPr>
-            <w:tcW w:type="dxa" w:w="3265"/>
+            <w:tcW w:type="dxa" w:w="3600"/>
             <w:tcBorders>
               <w:top w:val="single" w:color="999999" w:sz="4"/>
               <w:left w:val="single" w:color="999999" w:sz="4"/>
@@ -5168,7 +4164,7 @@
         </w:tc>
         <w:tc>
           <w:tcPr>
-            <w:tcW w:type="dxa" w:w="1784"/>
+            <w:tcW w:type="dxa" w:w="1965"/>
             <w:tcBorders>
               <w:top w:val="single" w:color="999999" w:sz="4"/>
               <w:left w:val="single" w:color="999999" w:sz="4"/>
@@ -5219,11 +4215,10 @@
         </w:tblBorders>
       </w:tblPr>
       <w:tblGrid>
-        <w:gridCol w:w="1494"/>
-        <w:gridCol w:w="1358"/>
-        <w:gridCol w:w="5705"/>
-        <w:gridCol w:w="2037"/>
-        <w:gridCol w:w="3806"/>
+        <w:gridCol w:w="2057"/>
+        <w:gridCol w:w="7200"/>
+        <w:gridCol w:w="2571"/>
+        <w:gridCol w:w="2572"/>
       </w:tblGrid>
       <w:tr>
         <w:trPr>
@@ -5231,7 +4226,7 @@
         </w:trPr>
         <w:tc>
           <w:tcPr>
-            <w:tcW w:type="dxa" w:w="1494"/>
+            <w:tcW w:type="dxa" w:w="2057"/>
             <w:tcBorders>
               <w:top w:val="single" w:color="999999" w:sz="4"/>
               <w:left w:val="single" w:color="999999" w:sz="4"/>
@@ -5255,13 +4250,13 @@
                 <w:sz w:val="19"/>
                 <w:szCs w:val="19"/>
               </w:rPr>
-              <w:t xml:space="preserve">Estado</w:t>
-            </w:r>
-          </w:p>
-        </w:tc>
-        <w:tc>
-          <w:tcPr>
-            <w:tcW w:type="dxa" w:w="1358"/>
+              <w:t xml:space="preserve">ID</w:t>
+            </w:r>
+          </w:p>
+        </w:tc>
+        <w:tc>
+          <w:tcPr>
+            <w:tcW w:type="dxa" w:w="7200"/>
             <w:tcBorders>
               <w:top w:val="single" w:color="999999" w:sz="4"/>
               <w:left w:val="single" w:color="999999" w:sz="4"/>
@@ -5285,13 +4280,13 @@
                 <w:sz w:val="19"/>
                 <w:szCs w:val="19"/>
               </w:rPr>
-              <w:t xml:space="preserve">ID</w:t>
-            </w:r>
-          </w:p>
-        </w:tc>
-        <w:tc>
-          <w:tcPr>
-            <w:tcW w:type="dxa" w:w="5705"/>
+              <w:t xml:space="preserve">Descripción</w:t>
+            </w:r>
+          </w:p>
+        </w:tc>
+        <w:tc>
+          <w:tcPr>
+            <w:tcW w:type="dxa" w:w="2571"/>
             <w:tcBorders>
               <w:top w:val="single" w:color="999999" w:sz="4"/>
               <w:left w:val="single" w:color="999999" w:sz="4"/>
@@ -5315,13 +4310,13 @@
                 <w:sz w:val="19"/>
                 <w:szCs w:val="19"/>
               </w:rPr>
-              <w:t xml:space="preserve">Descripción</w:t>
-            </w:r>
-          </w:p>
-        </w:tc>
-        <w:tc>
-          <w:tcPr>
-            <w:tcW w:type="dxa" w:w="2037"/>
+              <w:t xml:space="preserve">Atributo (ISO 9126)</w:t>
+            </w:r>
+          </w:p>
+        </w:tc>
+        <w:tc>
+          <w:tcPr>
+            <w:tcW w:type="dxa" w:w="2572"/>
             <w:tcBorders>
               <w:top w:val="single" w:color="999999" w:sz="4"/>
               <w:left w:val="single" w:color="999999" w:sz="4"/>
@@ -5345,37 +4340,7 @@
                 <w:sz w:val="19"/>
                 <w:szCs w:val="19"/>
               </w:rPr>
-              <w:t xml:space="preserve">Atributo (ISO 9126)</w:t>
-            </w:r>
-          </w:p>
-        </w:tc>
-        <w:tc>
-          <w:tcPr>
-            <w:tcW w:type="dxa" w:w="3806"/>
-            <w:tcBorders>
-              <w:top w:val="single" w:color="999999" w:sz="4"/>
-              <w:left w:val="single" w:color="999999" w:sz="4"/>
-              <w:bottom w:val="single" w:color="999999" w:sz="4"/>
-              <w:right w:val="single" w:color="999999" w:sz="4"/>
-            </w:tcBorders>
-            <w:shd w:fill="1B5E3A" w:color="auto" w:val="clear"/>
-            <w:tcMar>
-              <w:top w:type="dxa" w:w="60"/>
-              <w:left w:type="dxa" w:w="100"/>
-              <w:bottom w:type="dxa" w:w="60"/>
-              <w:right w:type="dxa" w:w="100"/>
-            </w:tcMar>
-          </w:tcPr>
-          <w:p>
-            <w:r>
-              <w:rPr>
-                <w:b/>
-                <w:bCs/>
-                <w:color w:val="FFFFFF"/>
-                <w:sz w:val="19"/>
-                <w:szCs w:val="19"/>
-              </w:rPr>
-              <w:t xml:space="preserve">Verificación prevista</w:t>
+              <w:t xml:space="preserve">Verificación</w:t>
             </w:r>
           </w:p>
         </w:tc>
@@ -5386,37 +4351,7 @@
         </w:trPr>
         <w:tc>
           <w:tcPr>
-            <w:tcW w:type="dxa" w:w="1494"/>
-            <w:tcBorders>
-              <w:top w:val="single" w:color="999999" w:sz="4"/>
-              <w:left w:val="single" w:color="999999" w:sz="4"/>
-              <w:bottom w:val="single" w:color="999999" w:sz="4"/>
-              <w:right w:val="single" w:color="999999" w:sz="4"/>
-            </w:tcBorders>
-            <w:shd w:fill="FFFFFF" w:color="auto" w:val="clear"/>
-            <w:tcMar>
-              <w:top w:type="dxa" w:w="60"/>
-              <w:left w:type="dxa" w:w="100"/>
-              <w:bottom w:type="dxa" w:w="60"/>
-              <w:right w:type="dxa" w:w="100"/>
-            </w:tcMar>
-          </w:tcPr>
-          <w:p>
-            <w:r>
-              <w:rPr>
-                <w:b w:val="false"/>
-                <w:bCs w:val="false"/>
-                <w:color w:val="000000"/>
-                <w:sz w:val="19"/>
-                <w:szCs w:val="19"/>
-              </w:rPr>
-              <w:t xml:space="preserve">Pendiente</w:t>
-            </w:r>
-          </w:p>
-        </w:tc>
-        <w:tc>
-          <w:tcPr>
-            <w:tcW w:type="dxa" w:w="1358"/>
+            <w:tcW w:type="dxa" w:w="2057"/>
             <w:tcBorders>
               <w:top w:val="single" w:color="999999" w:sz="4"/>
               <w:left w:val="single" w:color="999999" w:sz="4"/>
@@ -5446,7 +4381,7 @@
         </w:tc>
         <w:tc>
           <w:tcPr>
-            <w:tcW w:type="dxa" w:w="5705"/>
+            <w:tcW w:type="dxa" w:w="7200"/>
             <w:tcBorders>
               <w:top w:val="single" w:color="999999" w:sz="4"/>
               <w:left w:val="single" w:color="999999" w:sz="4"/>
@@ -5476,7 +4411,7 @@
         </w:tc>
         <w:tc>
           <w:tcPr>
-            <w:tcW w:type="dxa" w:w="2037"/>
+            <w:tcW w:type="dxa" w:w="2571"/>
             <w:tcBorders>
               <w:top w:val="single" w:color="999999" w:sz="4"/>
               <w:left w:val="single" w:color="999999" w:sz="4"/>
@@ -5506,7 +4441,7 @@
         </w:tc>
         <w:tc>
           <w:tcPr>
-            <w:tcW w:type="dxa" w:w="3806"/>
+            <w:tcW w:type="dxa" w:w="2572"/>
             <w:tcBorders>
               <w:top w:val="single" w:color="999999" w:sz="4"/>
               <w:left w:val="single" w:color="999999" w:sz="4"/>
@@ -5541,37 +4476,7 @@
         </w:trPr>
         <w:tc>
           <w:tcPr>
-            <w:tcW w:type="dxa" w:w="1494"/>
-            <w:tcBorders>
-              <w:top w:val="single" w:color="999999" w:sz="4"/>
-              <w:left w:val="single" w:color="999999" w:sz="4"/>
-              <w:bottom w:val="single" w:color="999999" w:sz="4"/>
-              <w:right w:val="single" w:color="999999" w:sz="4"/>
-            </w:tcBorders>
-            <w:shd w:fill="FFFFFF" w:color="auto" w:val="clear"/>
-            <w:tcMar>
-              <w:top w:type="dxa" w:w="60"/>
-              <w:left w:type="dxa" w:w="100"/>
-              <w:bottom w:type="dxa" w:w="60"/>
-              <w:right w:type="dxa" w:w="100"/>
-            </w:tcMar>
-          </w:tcPr>
-          <w:p>
-            <w:r>
-              <w:rPr>
-                <w:b w:val="false"/>
-                <w:bCs w:val="false"/>
-                <w:color w:val="000000"/>
-                <w:sz w:val="19"/>
-                <w:szCs w:val="19"/>
-              </w:rPr>
-              <w:t xml:space="preserve">Pendiente</w:t>
-            </w:r>
-          </w:p>
-        </w:tc>
-        <w:tc>
-          <w:tcPr>
-            <w:tcW w:type="dxa" w:w="1358"/>
+            <w:tcW w:type="dxa" w:w="2057"/>
             <w:tcBorders>
               <w:top w:val="single" w:color="999999" w:sz="4"/>
               <w:left w:val="single" w:color="999999" w:sz="4"/>
@@ -5601,7 +4506,7 @@
         </w:tc>
         <w:tc>
           <w:tcPr>
-            <w:tcW w:type="dxa" w:w="5705"/>
+            <w:tcW w:type="dxa" w:w="7200"/>
             <w:tcBorders>
               <w:top w:val="single" w:color="999999" w:sz="4"/>
               <w:left w:val="single" w:color="999999" w:sz="4"/>
@@ -5631,7 +4536,7 @@
         </w:tc>
         <w:tc>
           <w:tcPr>
-            <w:tcW w:type="dxa" w:w="2037"/>
+            <w:tcW w:type="dxa" w:w="2571"/>
             <w:tcBorders>
               <w:top w:val="single" w:color="999999" w:sz="4"/>
               <w:left w:val="single" w:color="999999" w:sz="4"/>
@@ -5661,7 +4566,7 @@
         </w:tc>
         <w:tc>
           <w:tcPr>
-            <w:tcW w:type="dxa" w:w="3806"/>
+            <w:tcW w:type="dxa" w:w="2572"/>
             <w:tcBorders>
               <w:top w:val="single" w:color="999999" w:sz="4"/>
               <w:left w:val="single" w:color="999999" w:sz="4"/>
@@ -5696,37 +4601,7 @@
         </w:trPr>
         <w:tc>
           <w:tcPr>
-            <w:tcW w:type="dxa" w:w="1494"/>
-            <w:tcBorders>
-              <w:top w:val="single" w:color="999999" w:sz="4"/>
-              <w:left w:val="single" w:color="999999" w:sz="4"/>
-              <w:bottom w:val="single" w:color="999999" w:sz="4"/>
-              <w:right w:val="single" w:color="999999" w:sz="4"/>
-            </w:tcBorders>
-            <w:shd w:fill="FFFFFF" w:color="auto" w:val="clear"/>
-            <w:tcMar>
-              <w:top w:type="dxa" w:w="60"/>
-              <w:left w:type="dxa" w:w="100"/>
-              <w:bottom w:type="dxa" w:w="60"/>
-              <w:right w:type="dxa" w:w="100"/>
-            </w:tcMar>
-          </w:tcPr>
-          <w:p>
-            <w:r>
-              <w:rPr>
-                <w:b w:val="false"/>
-                <w:bCs w:val="false"/>
-                <w:color w:val="000000"/>
-                <w:sz w:val="19"/>
-                <w:szCs w:val="19"/>
-              </w:rPr>
-              <w:t xml:space="preserve">Pendiente</w:t>
-            </w:r>
-          </w:p>
-        </w:tc>
-        <w:tc>
-          <w:tcPr>
-            <w:tcW w:type="dxa" w:w="1358"/>
+            <w:tcW w:type="dxa" w:w="2057"/>
             <w:tcBorders>
               <w:top w:val="single" w:color="999999" w:sz="4"/>
               <w:left w:val="single" w:color="999999" w:sz="4"/>
@@ -5756,7 +4631,7 @@
         </w:tc>
         <w:tc>
           <w:tcPr>
-            <w:tcW w:type="dxa" w:w="5705"/>
+            <w:tcW w:type="dxa" w:w="7200"/>
             <w:tcBorders>
               <w:top w:val="single" w:color="999999" w:sz="4"/>
               <w:left w:val="single" w:color="999999" w:sz="4"/>
@@ -5786,7 +4661,7 @@
         </w:tc>
         <w:tc>
           <w:tcPr>
-            <w:tcW w:type="dxa" w:w="2037"/>
+            <w:tcW w:type="dxa" w:w="2571"/>
             <w:tcBorders>
               <w:top w:val="single" w:color="999999" w:sz="4"/>
               <w:left w:val="single" w:color="999999" w:sz="4"/>
@@ -5816,7 +4691,7 @@
         </w:tc>
         <w:tc>
           <w:tcPr>
-            <w:tcW w:type="dxa" w:w="3806"/>
+            <w:tcW w:type="dxa" w:w="2572"/>
             <w:tcBorders>
               <w:top w:val="single" w:color="999999" w:sz="4"/>
               <w:left w:val="single" w:color="999999" w:sz="4"/>
@@ -5851,37 +4726,7 @@
         </w:trPr>
         <w:tc>
           <w:tcPr>
-            <w:tcW w:type="dxa" w:w="1494"/>
-            <w:tcBorders>
-              <w:top w:val="single" w:color="999999" w:sz="4"/>
-              <w:left w:val="single" w:color="999999" w:sz="4"/>
-              <w:bottom w:val="single" w:color="999999" w:sz="4"/>
-              <w:right w:val="single" w:color="999999" w:sz="4"/>
-            </w:tcBorders>
-            <w:shd w:fill="FFFFFF" w:color="auto" w:val="clear"/>
-            <w:tcMar>
-              <w:top w:type="dxa" w:w="60"/>
-              <w:left w:type="dxa" w:w="100"/>
-              <w:bottom w:type="dxa" w:w="60"/>
-              <w:right w:type="dxa" w:w="100"/>
-            </w:tcMar>
-          </w:tcPr>
-          <w:p>
-            <w:r>
-              <w:rPr>
-                <w:b w:val="false"/>
-                <w:bCs w:val="false"/>
-                <w:color w:val="000000"/>
-                <w:sz w:val="19"/>
-                <w:szCs w:val="19"/>
-              </w:rPr>
-              <w:t xml:space="preserve">Pendiente</w:t>
-            </w:r>
-          </w:p>
-        </w:tc>
-        <w:tc>
-          <w:tcPr>
-            <w:tcW w:type="dxa" w:w="1358"/>
+            <w:tcW w:type="dxa" w:w="2057"/>
             <w:tcBorders>
               <w:top w:val="single" w:color="999999" w:sz="4"/>
               <w:left w:val="single" w:color="999999" w:sz="4"/>
@@ -5911,7 +4756,7 @@
         </w:tc>
         <w:tc>
           <w:tcPr>
-            <w:tcW w:type="dxa" w:w="5705"/>
+            <w:tcW w:type="dxa" w:w="7200"/>
             <w:tcBorders>
               <w:top w:val="single" w:color="999999" w:sz="4"/>
               <w:left w:val="single" w:color="999999" w:sz="4"/>
@@ -5941,7 +4786,7 @@
         </w:tc>
         <w:tc>
           <w:tcPr>
-            <w:tcW w:type="dxa" w:w="2037"/>
+            <w:tcW w:type="dxa" w:w="2571"/>
             <w:tcBorders>
               <w:top w:val="single" w:color="999999" w:sz="4"/>
               <w:left w:val="single" w:color="999999" w:sz="4"/>
@@ -5971,7 +4816,7 @@
         </w:tc>
         <w:tc>
           <w:tcPr>
-            <w:tcW w:type="dxa" w:w="3806"/>
+            <w:tcW w:type="dxa" w:w="2572"/>
             <w:tcBorders>
               <w:top w:val="single" w:color="999999" w:sz="4"/>
               <w:left w:val="single" w:color="999999" w:sz="4"/>
@@ -6006,37 +4851,7 @@
         </w:trPr>
         <w:tc>
           <w:tcPr>
-            <w:tcW w:type="dxa" w:w="1494"/>
-            <w:tcBorders>
-              <w:top w:val="single" w:color="999999" w:sz="4"/>
-              <w:left w:val="single" w:color="999999" w:sz="4"/>
-              <w:bottom w:val="single" w:color="999999" w:sz="4"/>
-              <w:right w:val="single" w:color="999999" w:sz="4"/>
-            </w:tcBorders>
-            <w:shd w:fill="FFFFFF" w:color="auto" w:val="clear"/>
-            <w:tcMar>
-              <w:top w:type="dxa" w:w="60"/>
-              <w:left w:type="dxa" w:w="100"/>
-              <w:bottom w:type="dxa" w:w="60"/>
-              <w:right w:type="dxa" w:w="100"/>
-            </w:tcMar>
-          </w:tcPr>
-          <w:p>
-            <w:r>
-              <w:rPr>
-                <w:b w:val="false"/>
-                <w:bCs w:val="false"/>
-                <w:color w:val="000000"/>
-                <w:sz w:val="19"/>
-                <w:szCs w:val="19"/>
-              </w:rPr>
-              <w:t xml:space="preserve">Pendiente</w:t>
-            </w:r>
-          </w:p>
-        </w:tc>
-        <w:tc>
-          <w:tcPr>
-            <w:tcW w:type="dxa" w:w="1358"/>
+            <w:tcW w:type="dxa" w:w="2057"/>
             <w:tcBorders>
               <w:top w:val="single" w:color="999999" w:sz="4"/>
               <w:left w:val="single" w:color="999999" w:sz="4"/>
@@ -6066,7 +4881,7 @@
         </w:tc>
         <w:tc>
           <w:tcPr>
-            <w:tcW w:type="dxa" w:w="5705"/>
+            <w:tcW w:type="dxa" w:w="7200"/>
             <w:tcBorders>
               <w:top w:val="single" w:color="999999" w:sz="4"/>
               <w:left w:val="single" w:color="999999" w:sz="4"/>
@@ -6096,7 +4911,7 @@
         </w:tc>
         <w:tc>
           <w:tcPr>
-            <w:tcW w:type="dxa" w:w="2037"/>
+            <w:tcW w:type="dxa" w:w="2571"/>
             <w:tcBorders>
               <w:top w:val="single" w:color="999999" w:sz="4"/>
               <w:left w:val="single" w:color="999999" w:sz="4"/>
@@ -6126,7 +4941,7 @@
         </w:tc>
         <w:tc>
           <w:tcPr>
-            <w:tcW w:type="dxa" w:w="3806"/>
+            <w:tcW w:type="dxa" w:w="2572"/>
             <w:tcBorders>
               <w:top w:val="single" w:color="999999" w:sz="4"/>
               <w:left w:val="single" w:color="999999" w:sz="4"/>
@@ -6161,37 +4976,7 @@
         </w:trPr>
         <w:tc>
           <w:tcPr>
-            <w:tcW w:type="dxa" w:w="1494"/>
-            <w:tcBorders>
-              <w:top w:val="single" w:color="999999" w:sz="4"/>
-              <w:left w:val="single" w:color="999999" w:sz="4"/>
-              <w:bottom w:val="single" w:color="999999" w:sz="4"/>
-              <w:right w:val="single" w:color="999999" w:sz="4"/>
-            </w:tcBorders>
-            <w:shd w:fill="FFFFFF" w:color="auto" w:val="clear"/>
-            <w:tcMar>
-              <w:top w:type="dxa" w:w="60"/>
-              <w:left w:type="dxa" w:w="100"/>
-              <w:bottom w:type="dxa" w:w="60"/>
-              <w:right w:type="dxa" w:w="100"/>
-            </w:tcMar>
-          </w:tcPr>
-          <w:p>
-            <w:r>
-              <w:rPr>
-                <w:b w:val="false"/>
-                <w:bCs w:val="false"/>
-                <w:color w:val="000000"/>
-                <w:sz w:val="19"/>
-                <w:szCs w:val="19"/>
-              </w:rPr>
-              <w:t xml:space="preserve">Pendiente</w:t>
-            </w:r>
-          </w:p>
-        </w:tc>
-        <w:tc>
-          <w:tcPr>
-            <w:tcW w:type="dxa" w:w="1358"/>
+            <w:tcW w:type="dxa" w:w="2057"/>
             <w:tcBorders>
               <w:top w:val="single" w:color="999999" w:sz="4"/>
               <w:left w:val="single" w:color="999999" w:sz="4"/>
@@ -6221,7 +5006,7 @@
         </w:tc>
         <w:tc>
           <w:tcPr>
-            <w:tcW w:type="dxa" w:w="5705"/>
+            <w:tcW w:type="dxa" w:w="7200"/>
             <w:tcBorders>
               <w:top w:val="single" w:color="999999" w:sz="4"/>
               <w:left w:val="single" w:color="999999" w:sz="4"/>
@@ -6251,7 +5036,7 @@
         </w:tc>
         <w:tc>
           <w:tcPr>
-            <w:tcW w:type="dxa" w:w="2037"/>
+            <w:tcW w:type="dxa" w:w="2571"/>
             <w:tcBorders>
               <w:top w:val="single" w:color="999999" w:sz="4"/>
               <w:left w:val="single" w:color="999999" w:sz="4"/>
@@ -6281,7 +5066,7 @@
         </w:tc>
         <w:tc>
           <w:tcPr>
-            <w:tcW w:type="dxa" w:w="3806"/>
+            <w:tcW w:type="dxa" w:w="2572"/>
             <w:tcBorders>
               <w:top w:val="single" w:color="999999" w:sz="4"/>
               <w:left w:val="single" w:color="999999" w:sz="4"/>
@@ -6316,37 +5101,7 @@
         </w:trPr>
         <w:tc>
           <w:tcPr>
-            <w:tcW w:type="dxa" w:w="1494"/>
-            <w:tcBorders>
-              <w:top w:val="single" w:color="999999" w:sz="4"/>
-              <w:left w:val="single" w:color="999999" w:sz="4"/>
-              <w:bottom w:val="single" w:color="999999" w:sz="4"/>
-              <w:right w:val="single" w:color="999999" w:sz="4"/>
-            </w:tcBorders>
-            <w:shd w:fill="FFFFFF" w:color="auto" w:val="clear"/>
-            <w:tcMar>
-              <w:top w:type="dxa" w:w="60"/>
-              <w:left w:type="dxa" w:w="100"/>
-              <w:bottom w:type="dxa" w:w="60"/>
-              <w:right w:type="dxa" w:w="100"/>
-            </w:tcMar>
-          </w:tcPr>
-          <w:p>
-            <w:r>
-              <w:rPr>
-                <w:b w:val="false"/>
-                <w:bCs w:val="false"/>
-                <w:color w:val="000000"/>
-                <w:sz w:val="19"/>
-                <w:szCs w:val="19"/>
-              </w:rPr>
-              <w:t xml:space="preserve">Pendiente</w:t>
-            </w:r>
-          </w:p>
-        </w:tc>
-        <w:tc>
-          <w:tcPr>
-            <w:tcW w:type="dxa" w:w="1358"/>
+            <w:tcW w:type="dxa" w:w="2057"/>
             <w:tcBorders>
               <w:top w:val="single" w:color="999999" w:sz="4"/>
               <w:left w:val="single" w:color="999999" w:sz="4"/>
@@ -6376,7 +5131,7 @@
         </w:tc>
         <w:tc>
           <w:tcPr>
-            <w:tcW w:type="dxa" w:w="5705"/>
+            <w:tcW w:type="dxa" w:w="7200"/>
             <w:tcBorders>
               <w:top w:val="single" w:color="999999" w:sz="4"/>
               <w:left w:val="single" w:color="999999" w:sz="4"/>
@@ -6406,7 +5161,7 @@
         </w:tc>
         <w:tc>
           <w:tcPr>
-            <w:tcW w:type="dxa" w:w="2037"/>
+            <w:tcW w:type="dxa" w:w="2571"/>
             <w:tcBorders>
               <w:top w:val="single" w:color="999999" w:sz="4"/>
               <w:left w:val="single" w:color="999999" w:sz="4"/>
@@ -6436,7 +5191,7 @@
         </w:tc>
         <w:tc>
           <w:tcPr>
-            <w:tcW w:type="dxa" w:w="3806"/>
+            <w:tcW w:type="dxa" w:w="2572"/>
             <w:tcBorders>
               <w:top w:val="single" w:color="999999" w:sz="4"/>
               <w:left w:val="single" w:color="999999" w:sz="4"/>
@@ -6487,9 +5242,8 @@
         </w:tblBorders>
       </w:tblPr>
       <w:tblGrid>
-        <w:gridCol w:w="1568"/>
-        <w:gridCol w:w="1425"/>
-        <w:gridCol w:w="11407"/>
+        <w:gridCol w:w="1878"/>
+        <w:gridCol w:w="12522"/>
       </w:tblGrid>
       <w:tr>
         <w:trPr>
@@ -6497,7 +5251,7 @@
         </w:trPr>
         <w:tc>
           <w:tcPr>
-            <w:tcW w:type="dxa" w:w="1568"/>
+            <w:tcW w:type="dxa" w:w="1878"/>
             <w:tcBorders>
               <w:top w:val="single" w:color="999999" w:sz="4"/>
               <w:left w:val="single" w:color="999999" w:sz="4"/>
@@ -6521,43 +5275,13 @@
                 <w:sz w:val="19"/>
                 <w:szCs w:val="19"/>
               </w:rPr>
-              <w:t xml:space="preserve">Estado</w:t>
-            </w:r>
-          </w:p>
-        </w:tc>
-        <w:tc>
-          <w:tcPr>
-            <w:tcW w:type="dxa" w:w="1425"/>
-            <w:tcBorders>
-              <w:top w:val="single" w:color="999999" w:sz="4"/>
-              <w:left w:val="single" w:color="999999" w:sz="4"/>
-              <w:bottom w:val="single" w:color="999999" w:sz="4"/>
-              <w:right w:val="single" w:color="999999" w:sz="4"/>
-            </w:tcBorders>
-            <w:shd w:fill="1B5E3A" w:color="auto" w:val="clear"/>
-            <w:tcMar>
-              <w:top w:type="dxa" w:w="60"/>
-              <w:left w:type="dxa" w:w="100"/>
-              <w:bottom w:type="dxa" w:w="60"/>
-              <w:right w:type="dxa" w:w="100"/>
-            </w:tcMar>
-          </w:tcPr>
-          <w:p>
-            <w:r>
-              <w:rPr>
-                <w:b/>
-                <w:bCs/>
-                <w:color w:val="FFFFFF"/>
-                <w:sz w:val="19"/>
-                <w:szCs w:val="19"/>
-              </w:rPr>
               <w:t xml:space="preserve">ID</w:t>
             </w:r>
           </w:p>
         </w:tc>
         <w:tc>
           <w:tcPr>
-            <w:tcW w:type="dxa" w:w="11407"/>
+            <w:tcW w:type="dxa" w:w="12522"/>
             <w:tcBorders>
               <w:top w:val="single" w:color="999999" w:sz="4"/>
               <w:left w:val="single" w:color="999999" w:sz="4"/>
@@ -6592,37 +5316,7 @@
         </w:trPr>
         <w:tc>
           <w:tcPr>
-            <w:tcW w:type="dxa" w:w="1568"/>
-            <w:tcBorders>
-              <w:top w:val="single" w:color="999999" w:sz="4"/>
-              <w:left w:val="single" w:color="999999" w:sz="4"/>
-              <w:bottom w:val="single" w:color="999999" w:sz="4"/>
-              <w:right w:val="single" w:color="999999" w:sz="4"/>
-            </w:tcBorders>
-            <w:shd w:fill="FFFFFF" w:color="auto" w:val="clear"/>
-            <w:tcMar>
-              <w:top w:type="dxa" w:w="60"/>
-              <w:left w:type="dxa" w:w="100"/>
-              <w:bottom w:type="dxa" w:w="60"/>
-              <w:right w:type="dxa" w:w="100"/>
-            </w:tcMar>
-          </w:tcPr>
-          <w:p>
-            <w:r>
-              <w:rPr>
-                <w:b w:val="false"/>
-                <w:bCs w:val="false"/>
-                <w:color w:val="000000"/>
-                <w:sz w:val="19"/>
-                <w:szCs w:val="19"/>
-              </w:rPr>
-              <w:t xml:space="preserve">Pendiente</w:t>
-            </w:r>
-          </w:p>
-        </w:tc>
-        <w:tc>
-          <w:tcPr>
-            <w:tcW w:type="dxa" w:w="1425"/>
+            <w:tcW w:type="dxa" w:w="1878"/>
             <w:tcBorders>
               <w:top w:val="single" w:color="999999" w:sz="4"/>
               <w:left w:val="single" w:color="999999" w:sz="4"/>
@@ -6652,7 +5346,7 @@
         </w:tc>
         <w:tc>
           <w:tcPr>
-            <w:tcW w:type="dxa" w:w="11407"/>
+            <w:tcW w:type="dxa" w:w="12522"/>
             <w:tcBorders>
               <w:top w:val="single" w:color="999999" w:sz="4"/>
               <w:left w:val="single" w:color="999999" w:sz="4"/>
@@ -6687,37 +5381,7 @@
         </w:trPr>
         <w:tc>
           <w:tcPr>
-            <w:tcW w:type="dxa" w:w="1568"/>
-            <w:tcBorders>
-              <w:top w:val="single" w:color="999999" w:sz="4"/>
-              <w:left w:val="single" w:color="999999" w:sz="4"/>
-              <w:bottom w:val="single" w:color="999999" w:sz="4"/>
-              <w:right w:val="single" w:color="999999" w:sz="4"/>
-            </w:tcBorders>
-            <w:shd w:fill="FFFFFF" w:color="auto" w:val="clear"/>
-            <w:tcMar>
-              <w:top w:type="dxa" w:w="60"/>
-              <w:left w:type="dxa" w:w="100"/>
-              <w:bottom w:type="dxa" w:w="60"/>
-              <w:right w:type="dxa" w:w="100"/>
-            </w:tcMar>
-          </w:tcPr>
-          <w:p>
-            <w:r>
-              <w:rPr>
-                <w:b w:val="false"/>
-                <w:bCs w:val="false"/>
-                <w:color w:val="000000"/>
-                <w:sz w:val="19"/>
-                <w:szCs w:val="19"/>
-              </w:rPr>
-              <w:t xml:space="preserve">Pendiente</w:t>
-            </w:r>
-          </w:p>
-        </w:tc>
-        <w:tc>
-          <w:tcPr>
-            <w:tcW w:type="dxa" w:w="1425"/>
+            <w:tcW w:type="dxa" w:w="1878"/>
             <w:tcBorders>
               <w:top w:val="single" w:color="999999" w:sz="4"/>
               <w:left w:val="single" w:color="999999" w:sz="4"/>
@@ -6747,7 +5411,7 @@
         </w:tc>
         <w:tc>
           <w:tcPr>
-            <w:tcW w:type="dxa" w:w="11407"/>
+            <w:tcW w:type="dxa" w:w="12522"/>
             <w:tcBorders>
               <w:top w:val="single" w:color="999999" w:sz="4"/>
               <w:left w:val="single" w:color="999999" w:sz="4"/>
@@ -6782,37 +5446,7 @@
         </w:trPr>
         <w:tc>
           <w:tcPr>
-            <w:tcW w:type="dxa" w:w="1568"/>
-            <w:tcBorders>
-              <w:top w:val="single" w:color="999999" w:sz="4"/>
-              <w:left w:val="single" w:color="999999" w:sz="4"/>
-              <w:bottom w:val="single" w:color="999999" w:sz="4"/>
-              <w:right w:val="single" w:color="999999" w:sz="4"/>
-            </w:tcBorders>
-            <w:shd w:fill="FFFFFF" w:color="auto" w:val="clear"/>
-            <w:tcMar>
-              <w:top w:type="dxa" w:w="60"/>
-              <w:left w:type="dxa" w:w="100"/>
-              <w:bottom w:type="dxa" w:w="60"/>
-              <w:right w:type="dxa" w:w="100"/>
-            </w:tcMar>
-          </w:tcPr>
-          <w:p>
-            <w:r>
-              <w:rPr>
-                <w:b w:val="false"/>
-                <w:bCs w:val="false"/>
-                <w:color w:val="000000"/>
-                <w:sz w:val="19"/>
-                <w:szCs w:val="19"/>
-              </w:rPr>
-              <w:t xml:space="preserve">Pendiente</w:t>
-            </w:r>
-          </w:p>
-        </w:tc>
-        <w:tc>
-          <w:tcPr>
-            <w:tcW w:type="dxa" w:w="1425"/>
+            <w:tcW w:type="dxa" w:w="1878"/>
             <w:tcBorders>
               <w:top w:val="single" w:color="999999" w:sz="4"/>
               <w:left w:val="single" w:color="999999" w:sz="4"/>
@@ -6842,7 +5476,7 @@
         </w:tc>
         <w:tc>
           <w:tcPr>
-            <w:tcW w:type="dxa" w:w="11407"/>
+            <w:tcW w:type="dxa" w:w="12522"/>
             <w:tcBorders>
               <w:top w:val="single" w:color="999999" w:sz="4"/>
               <w:left w:val="single" w:color="999999" w:sz="4"/>
@@ -6877,37 +5511,7 @@
         </w:trPr>
         <w:tc>
           <w:tcPr>
-            <w:tcW w:type="dxa" w:w="1568"/>
-            <w:tcBorders>
-              <w:top w:val="single" w:color="999999" w:sz="4"/>
-              <w:left w:val="single" w:color="999999" w:sz="4"/>
-              <w:bottom w:val="single" w:color="999999" w:sz="4"/>
-              <w:right w:val="single" w:color="999999" w:sz="4"/>
-            </w:tcBorders>
-            <w:shd w:fill="FFFFFF" w:color="auto" w:val="clear"/>
-            <w:tcMar>
-              <w:top w:type="dxa" w:w="60"/>
-              <w:left w:type="dxa" w:w="100"/>
-              <w:bottom w:type="dxa" w:w="60"/>
-              <w:right w:type="dxa" w:w="100"/>
-            </w:tcMar>
-          </w:tcPr>
-          <w:p>
-            <w:r>
-              <w:rPr>
-                <w:b w:val="false"/>
-                <w:bCs w:val="false"/>
-                <w:color w:val="000000"/>
-                <w:sz w:val="19"/>
-                <w:szCs w:val="19"/>
-              </w:rPr>
-              <w:t xml:space="preserve">Pendiente</w:t>
-            </w:r>
-          </w:p>
-        </w:tc>
-        <w:tc>
-          <w:tcPr>
-            <w:tcW w:type="dxa" w:w="1425"/>
+            <w:tcW w:type="dxa" w:w="1878"/>
             <w:tcBorders>
               <w:top w:val="single" w:color="999999" w:sz="4"/>
               <w:left w:val="single" w:color="999999" w:sz="4"/>
@@ -6937,7 +5541,7 @@
         </w:tc>
         <w:tc>
           <w:tcPr>
-            <w:tcW w:type="dxa" w:w="11407"/>
+            <w:tcW w:type="dxa" w:w="12522"/>
             <w:tcBorders>
               <w:top w:val="single" w:color="999999" w:sz="4"/>
               <w:left w:val="single" w:color="999999" w:sz="4"/>
@@ -6972,37 +5576,7 @@
         </w:trPr>
         <w:tc>
           <w:tcPr>
-            <w:tcW w:type="dxa" w:w="1568"/>
-            <w:tcBorders>
-              <w:top w:val="single" w:color="999999" w:sz="4"/>
-              <w:left w:val="single" w:color="999999" w:sz="4"/>
-              <w:bottom w:val="single" w:color="999999" w:sz="4"/>
-              <w:right w:val="single" w:color="999999" w:sz="4"/>
-            </w:tcBorders>
-            <w:shd w:fill="FFFFFF" w:color="auto" w:val="clear"/>
-            <w:tcMar>
-              <w:top w:type="dxa" w:w="60"/>
-              <w:left w:type="dxa" w:w="100"/>
-              <w:bottom w:type="dxa" w:w="60"/>
-              <w:right w:type="dxa" w:w="100"/>
-            </w:tcMar>
-          </w:tcPr>
-          <w:p>
-            <w:r>
-              <w:rPr>
-                <w:b w:val="false"/>
-                <w:bCs w:val="false"/>
-                <w:color w:val="000000"/>
-                <w:sz w:val="19"/>
-                <w:szCs w:val="19"/>
-              </w:rPr>
-              <w:t xml:space="preserve">Pendiente</w:t>
-            </w:r>
-          </w:p>
-        </w:tc>
-        <w:tc>
-          <w:tcPr>
-            <w:tcW w:type="dxa" w:w="1425"/>
+            <w:tcW w:type="dxa" w:w="1878"/>
             <w:tcBorders>
               <w:top w:val="single" w:color="999999" w:sz="4"/>
               <w:left w:val="single" w:color="999999" w:sz="4"/>
@@ -7032,7 +5606,7 @@
         </w:tc>
         <w:tc>
           <w:tcPr>
-            <w:tcW w:type="dxa" w:w="11407"/>
+            <w:tcW w:type="dxa" w:w="12522"/>
             <w:tcBorders>
               <w:top w:val="single" w:color="999999" w:sz="4"/>
               <w:left w:val="single" w:color="999999" w:sz="4"/>
@@ -7067,37 +5641,7 @@
         </w:trPr>
         <w:tc>
           <w:tcPr>
-            <w:tcW w:type="dxa" w:w="1568"/>
-            <w:tcBorders>
-              <w:top w:val="single" w:color="999999" w:sz="4"/>
-              <w:left w:val="single" w:color="999999" w:sz="4"/>
-              <w:bottom w:val="single" w:color="999999" w:sz="4"/>
-              <w:right w:val="single" w:color="999999" w:sz="4"/>
-            </w:tcBorders>
-            <w:shd w:fill="FFFFFF" w:color="auto" w:val="clear"/>
-            <w:tcMar>
-              <w:top w:type="dxa" w:w="60"/>
-              <w:left w:type="dxa" w:w="100"/>
-              <w:bottom w:type="dxa" w:w="60"/>
-              <w:right w:type="dxa" w:w="100"/>
-            </w:tcMar>
-          </w:tcPr>
-          <w:p>
-            <w:r>
-              <w:rPr>
-                <w:b w:val="false"/>
-                <w:bCs w:val="false"/>
-                <w:color w:val="000000"/>
-                <w:sz w:val="19"/>
-                <w:szCs w:val="19"/>
-              </w:rPr>
-              <w:t xml:space="preserve">Pendiente</w:t>
-            </w:r>
-          </w:p>
-        </w:tc>
-        <w:tc>
-          <w:tcPr>
-            <w:tcW w:type="dxa" w:w="1425"/>
+            <w:tcW w:type="dxa" w:w="1878"/>
             <w:tcBorders>
               <w:top w:val="single" w:color="999999" w:sz="4"/>
               <w:left w:val="single" w:color="999999" w:sz="4"/>
@@ -7127,7 +5671,7 @@
         </w:tc>
         <w:tc>
           <w:tcPr>
-            <w:tcW w:type="dxa" w:w="11407"/>
+            <w:tcW w:type="dxa" w:w="12522"/>
             <w:tcBorders>
               <w:top w:val="single" w:color="999999" w:sz="4"/>
               <w:left w:val="single" w:color="999999" w:sz="4"/>

</xml_diff>